<commit_message>
Renamed count column to trigger column
</commit_message>
<xml_diff>
--- a/Documentation/DBGuard user-manual.docx
+++ b/Documentation/DBGuard user-manual.docx
@@ -101,7 +101,6 @@
                         <w:szCs w:val="88"/>
                       </w:rPr>
                     </w:pPr>
-                    <w:proofErr w:type="spellStart"/>
                     <w:r>
                       <w:rPr>
                         <w:rFonts w:ascii="Arial" w:eastAsiaTheme="majorEastAsia" w:hAnsi="Arial" w:cs="Arial"/>
@@ -111,7 +110,6 @@
                       </w:rPr>
                       <w:t>DBGuard</w:t>
                     </w:r>
-                    <w:proofErr w:type="spellEnd"/>
                   </w:p>
                 </w:sdtContent>
               </w:sdt>
@@ -312,63 +310,33 @@
           <w:rFonts w:ascii="Arial" w:hAnsi="Arial" w:cs="Arial"/>
         </w:rPr>
         <w:lastRenderedPageBreak/>
-        <w:t xml:space="preserve">What is </w:t>
-      </w:r>
-      <w:proofErr w:type="spellStart"/>
-      <w:r>
-        <w:rPr>
-          <w:rFonts w:ascii="Arial" w:hAnsi="Arial" w:cs="Arial"/>
-        </w:rPr>
-        <w:t>DBGuard</w:t>
-      </w:r>
-      <w:proofErr w:type="spellEnd"/>
-      <w:r>
-        <w:rPr>
-          <w:rFonts w:ascii="Arial" w:hAnsi="Arial" w:cs="Arial"/>
-        </w:rPr>
-        <w:t>?</w:t>
-      </w:r>
-    </w:p>
-    <w:p>
-      <w:pPr>
-        <w:rPr>
-          <w:rFonts w:ascii="Arial" w:hAnsi="Arial" w:cs="Arial"/>
-        </w:rPr>
-      </w:pPr>
-      <w:proofErr w:type="spellStart"/>
-      <w:r>
-        <w:rPr>
-          <w:rFonts w:ascii="Arial" w:hAnsi="Arial" w:cs="Arial"/>
-        </w:rPr>
-        <w:t>DBGuard</w:t>
-      </w:r>
-      <w:proofErr w:type="spellEnd"/>
-      <w:r>
-        <w:rPr>
-          <w:rFonts w:ascii="Arial" w:hAnsi="Arial" w:cs="Arial"/>
-        </w:rPr>
-        <w:t xml:space="preserve"> (Database Guard) is an application that periodically checks the state of your databases and sends notifications when specific conditions are met. It is useful for catching bad or unexpected data that could cause applications to crash, or for alerting a team when data meets any criteria that warrants attention.</w:t>
-      </w:r>
-    </w:p>
-    <w:p>
-      <w:pPr>
-        <w:rPr>
-          <w:rFonts w:ascii="Arial" w:hAnsi="Arial" w:cs="Arial"/>
-        </w:rPr>
-      </w:pPr>
-      <w:proofErr w:type="spellStart"/>
-      <w:r>
-        <w:rPr>
-          <w:rFonts w:ascii="Arial" w:hAnsi="Arial" w:cs="Arial"/>
-        </w:rPr>
-        <w:t>DBGuard</w:t>
-      </w:r>
-      <w:proofErr w:type="spellEnd"/>
-      <w:r>
-        <w:rPr>
-          <w:rFonts w:ascii="Arial" w:hAnsi="Arial" w:cs="Arial"/>
-        </w:rPr>
-        <w:t xml:space="preserve"> supports multiple database engines including SQL Server, PostgreSQL, SQLite, and MySQL.</w:t>
+        <w:t>What is DBGuard?</w:t>
+      </w:r>
+    </w:p>
+    <w:p>
+      <w:pPr>
+        <w:rPr>
+          <w:rFonts w:ascii="Arial" w:hAnsi="Arial" w:cs="Arial"/>
+        </w:rPr>
+      </w:pPr>
+      <w:r>
+        <w:rPr>
+          <w:rFonts w:ascii="Arial" w:hAnsi="Arial" w:cs="Arial"/>
+        </w:rPr>
+        <w:t>DBGuard (Database Guard) is an application that periodically checks the state of your databases and sends notifications when specific conditions are met. It is useful for catching bad or unexpected data that could cause applications to crash, or for alerting a team when data meets any criteria that warrants attention.</w:t>
+      </w:r>
+    </w:p>
+    <w:p>
+      <w:pPr>
+        <w:rPr>
+          <w:rFonts w:ascii="Arial" w:hAnsi="Arial" w:cs="Arial"/>
+        </w:rPr>
+      </w:pPr>
+      <w:r>
+        <w:rPr>
+          <w:rFonts w:ascii="Arial" w:hAnsi="Arial" w:cs="Arial"/>
+        </w:rPr>
+        <w:t>DBGuard supports multiple database engines including SQL Server, PostgreSQL, SQLite, and MySQL.</w:t>
       </w:r>
     </w:p>
     <w:p>
@@ -394,49 +362,7 @@
         <w:rPr>
           <w:rFonts w:ascii="Arial" w:hAnsi="Arial" w:cs="Arial"/>
         </w:rPr>
-        <w:t xml:space="preserve">When a Guard's expression </w:t>
-      </w:r>
-      <w:proofErr w:type="gramStart"/>
-      <w:r>
-        <w:rPr>
-          <w:rFonts w:ascii="Arial" w:hAnsi="Arial" w:cs="Arial"/>
-        </w:rPr>
-        <w:t>evaluates</w:t>
-      </w:r>
-      <w:proofErr w:type="gramEnd"/>
-      <w:r>
-        <w:rPr>
-          <w:rFonts w:ascii="Arial" w:hAnsi="Arial" w:cs="Arial"/>
-        </w:rPr>
-        <w:t xml:space="preserve"> to </w:t>
-      </w:r>
-      <w:proofErr w:type="gramStart"/>
-      <w:r>
-        <w:rPr>
-          <w:rFonts w:ascii="Arial" w:hAnsi="Arial" w:cs="Arial"/>
-        </w:rPr>
-        <w:t>true</w:t>
-      </w:r>
-      <w:proofErr w:type="gramEnd"/>
-      <w:r>
-        <w:rPr>
-          <w:rFonts w:ascii="Arial" w:hAnsi="Arial" w:cs="Arial"/>
-        </w:rPr>
-        <w:t xml:space="preserve">, it can trigger zero or more notifications via SMTP (email) or HTTP (webhooks to other applications or APIs). </w:t>
-      </w:r>
-      <w:proofErr w:type="spellStart"/>
-      <w:r>
-        <w:rPr>
-          <w:rFonts w:ascii="Arial" w:hAnsi="Arial" w:cs="Arial"/>
-        </w:rPr>
-        <w:t>DBGuard</w:t>
-      </w:r>
-      <w:proofErr w:type="spellEnd"/>
-      <w:r>
-        <w:rPr>
-          <w:rFonts w:ascii="Arial" w:hAnsi="Arial" w:cs="Arial"/>
-        </w:rPr>
-        <w:t xml:space="preserve"> also includes a built-in SPA web application for configuring, testing, and auditing Guards and their execution history.</w:t>
+        <w:t>When a Guard's expression evaluates to true, it can trigger zero or more notifications via SMTP (email) or HTTP (webhooks to other applications or APIs). DBGuard also includes a built-in SPA web application for configuring, testing, and auditing Guards and their execution history.</w:t>
       </w:r>
     </w:p>
     <w:p>
@@ -670,7 +596,19 @@
         <w:rPr>
           <w:rFonts w:ascii="Arial" w:hAnsi="Arial" w:cs="Arial"/>
         </w:rPr>
-        <w:t>: The user defined query and expression is not evaluated as true.</w:t>
+        <w:t xml:space="preserve">: The user defined query and expression is evaluated as </w:t>
+      </w:r>
+      <w:r>
+        <w:rPr>
+          <w:rFonts w:ascii="Arial" w:hAnsi="Arial" w:cs="Arial"/>
+        </w:rPr>
+        <w:t>false</w:t>
+      </w:r>
+      <w:r>
+        <w:rPr>
+          <w:rFonts w:ascii="Arial" w:hAnsi="Arial" w:cs="Arial"/>
+        </w:rPr>
+        <w:t>.</w:t>
       </w:r>
     </w:p>
     <w:p>
@@ -721,21 +659,19 @@
         <w:rPr>
           <w:rFonts w:ascii="Arial" w:hAnsi="Arial" w:cs="Arial"/>
         </w:rPr>
-        <w:t xml:space="preserve">best security practices. The credentials are encrypted and stored in the application database using an </w:t>
-      </w:r>
-      <w:proofErr w:type="spellStart"/>
-      <w:r>
-        <w:rPr>
-          <w:rFonts w:ascii="Arial" w:hAnsi="Arial" w:cs="Arial"/>
-        </w:rPr>
-        <w:t>IDataProtector</w:t>
-      </w:r>
-      <w:proofErr w:type="spellEnd"/>
-      <w:r>
-        <w:rPr>
-          <w:rFonts w:ascii="Arial" w:hAnsi="Arial" w:cs="Arial"/>
-        </w:rPr>
-        <w:t>. Some database engines such as SQLite do not use logins so it is not required.</w:t>
+        <w:t>best security practices. The credentials are encrypted and stored in the</w:t>
+      </w:r>
+      <w:r>
+        <w:rPr>
+          <w:rFonts w:ascii="Arial" w:hAnsi="Arial" w:cs="Arial"/>
+        </w:rPr>
+        <w:t xml:space="preserve"> PostgreSQL</w:t>
+      </w:r>
+      <w:r>
+        <w:rPr>
+          <w:rFonts w:ascii="Arial" w:hAnsi="Arial" w:cs="Arial"/>
+        </w:rPr>
+        <w:t xml:space="preserve"> application database using an IDataProtector. Some database engines such as SQLite do not use logins so it is not required.</w:t>
       </w:r>
     </w:p>
     <w:p>
@@ -823,6 +759,7 @@
       <w:r>
         <w:rPr>
           <w:rFonts w:ascii="Arial" w:hAnsi="Arial" w:cs="Arial"/>
+          <w:noProof/>
         </w:rPr>
         <w:drawing>
           <wp:inline distT="0" distB="0" distL="0" distR="0" wp14:anchorId="68566321" wp14:editId="48D57974">
@@ -892,10 +829,10 @@
         </w:rPr>
         <w:lastRenderedPageBreak/>
         <w:drawing>
-          <wp:inline distT="0" distB="0" distL="0" distR="0" wp14:anchorId="5D7625AD" wp14:editId="56EC9CDD">
-            <wp:extent cx="2178531" cy="6619875"/>
-            <wp:effectExtent l="0" t="0" r="0" b="0"/>
-            <wp:docPr id="1917961858" name="Picture 1"/>
+          <wp:inline distT="0" distB="0" distL="0" distR="0" wp14:anchorId="083EF353" wp14:editId="72096920">
+            <wp:extent cx="2696845" cy="8229600"/>
+            <wp:effectExtent l="0" t="0" r="8255" b="0"/>
+            <wp:docPr id="671810961" name="Picture 1"/>
             <wp:cNvGraphicFramePr>
               <a:graphicFrameLocks xmlns:a="http://schemas.openxmlformats.org/drawingml/2006/main" noChangeAspect="1"/>
             </wp:cNvGraphicFramePr>
@@ -903,7 +840,7 @@
               <a:graphicData uri="http://schemas.openxmlformats.org/drawingml/2006/picture">
                 <pic:pic xmlns:pic="http://schemas.openxmlformats.org/drawingml/2006/picture">
                   <pic:nvPicPr>
-                    <pic:cNvPr id="1917961858" name=""/>
+                    <pic:cNvPr id="671810961" name=""/>
                     <pic:cNvPicPr/>
                   </pic:nvPicPr>
                   <pic:blipFill>
@@ -915,7 +852,7 @@
                   <pic:spPr>
                     <a:xfrm>
                       <a:off x="0" y="0"/>
-                      <a:ext cx="2181537" cy="6629008"/>
+                      <a:ext cx="2696845" cy="8229600"/>
                     </a:xfrm>
                     <a:prstGeom prst="rect">
                       <a:avLst/>
@@ -943,6 +880,7 @@
         <w:rPr>
           <w:rFonts w:ascii="Arial" w:hAnsi="Arial" w:cs="Arial"/>
         </w:rPr>
+        <w:lastRenderedPageBreak/>
         <w:t>Here is what each field does:</w:t>
       </w:r>
     </w:p>
@@ -1059,76 +997,13 @@
         <w:rPr>
           <w:rFonts w:ascii="Arial" w:hAnsi="Arial" w:cs="Arial"/>
         </w:rPr>
-        <w:t xml:space="preserve">: The SQL query for the guard. The query needs to return a single column and row. The value needs to be </w:t>
-      </w:r>
-      <w:proofErr w:type="gramStart"/>
-      <w:r>
-        <w:rPr>
-          <w:rFonts w:ascii="Arial" w:hAnsi="Arial" w:cs="Arial"/>
-        </w:rPr>
-        <w:t>an</w:t>
-      </w:r>
-      <w:proofErr w:type="gramEnd"/>
-      <w:r>
-        <w:rPr>
-          <w:rFonts w:ascii="Arial" w:hAnsi="Arial" w:cs="Arial"/>
-        </w:rPr>
-        <w:t xml:space="preserve"> </w:t>
-      </w:r>
-      <w:r>
-        <w:rPr>
-          <w:rFonts w:ascii="Arial" w:hAnsi="Arial" w:cs="Arial"/>
-        </w:rPr>
-        <w:t xml:space="preserve">32bit </w:t>
-      </w:r>
-      <w:r>
-        <w:rPr>
-          <w:rFonts w:ascii="Arial" w:hAnsi="Arial" w:cs="Arial"/>
-        </w:rPr>
-        <w:t xml:space="preserve">integer value. The </w:t>
-      </w:r>
-      <w:r>
-        <w:rPr>
-          <w:rFonts w:ascii="Arial" w:hAnsi="Arial" w:cs="Arial"/>
-        </w:rPr>
-        <w:lastRenderedPageBreak/>
-        <w:t xml:space="preserve">reason for this is that all the logic should be implemented in the query. The application just wants to know the result integer </w:t>
-      </w:r>
-      <w:r>
-        <w:rPr>
-          <w:rFonts w:ascii="Arial" w:hAnsi="Arial" w:cs="Arial"/>
-        </w:rPr>
-        <w:t xml:space="preserve">value </w:t>
-      </w:r>
-      <w:r>
-        <w:rPr>
-          <w:rFonts w:ascii="Arial" w:hAnsi="Arial" w:cs="Arial"/>
-        </w:rPr>
-        <w:t xml:space="preserve">of your logic so </w:t>
-      </w:r>
-      <w:r>
-        <w:rPr>
-          <w:rFonts w:ascii="Arial" w:hAnsi="Arial" w:cs="Arial"/>
-        </w:rPr>
-        <w:t>it</w:t>
-      </w:r>
-      <w:r>
-        <w:rPr>
-          <w:rFonts w:ascii="Arial" w:hAnsi="Arial" w:cs="Arial"/>
-        </w:rPr>
-        <w:t xml:space="preserve"> can decide if it is triggered.</w:t>
-      </w:r>
-      <w:r>
-        <w:rPr>
-          <w:rFonts w:ascii="Arial" w:hAnsi="Arial" w:cs="Arial"/>
-        </w:rPr>
-        <w:t xml:space="preserve"> </w:t>
-      </w:r>
-      <w:r>
-        <w:rPr>
-          <w:rFonts w:ascii="Arial" w:hAnsi="Arial" w:cs="Arial"/>
-        </w:rPr>
-        <w:t>You can then configure the guard to trigger when the Count column is greater than one.</w:t>
+        <w:t>: The SQL query for the guard. The query needs to return a single row. The reason for this is that all the logic should be implemented in the query</w:t>
+      </w:r>
+      <w:r>
+        <w:rPr>
+          <w:rFonts w:ascii="Arial" w:hAnsi="Arial" w:cs="Arial"/>
+        </w:rPr>
+        <w:t xml:space="preserve"> and we only need a single record so we can look at the trigger column to evaluate the expression.</w:t>
       </w:r>
     </w:p>
     <w:p>
@@ -1148,13 +1023,45 @@
           <w:b/>
           <w:bCs/>
         </w:rPr>
-        <w:t>Count column</w:t>
-      </w:r>
-      <w:r>
-        <w:rPr>
-          <w:rFonts w:ascii="Arial" w:hAnsi="Arial" w:cs="Arial"/>
-        </w:rPr>
-        <w:t>: This is the name of the column.</w:t>
+        <w:t>Trigger</w:t>
+      </w:r>
+      <w:r>
+        <w:rPr>
+          <w:rFonts w:ascii="Arial" w:hAnsi="Arial" w:cs="Arial"/>
+          <w:b/>
+          <w:bCs/>
+        </w:rPr>
+        <w:t xml:space="preserve"> column</w:t>
+      </w:r>
+      <w:r>
+        <w:rPr>
+          <w:rFonts w:ascii="Arial" w:hAnsi="Arial" w:cs="Arial"/>
+        </w:rPr>
+        <w:t>: This is the name of the column</w:t>
+      </w:r>
+      <w:r>
+        <w:rPr>
+          <w:rFonts w:ascii="Arial" w:hAnsi="Arial" w:cs="Arial"/>
+        </w:rPr>
+        <w:t xml:space="preserve"> in our queries result record</w:t>
+      </w:r>
+      <w:r>
+        <w:rPr>
+          <w:rFonts w:ascii="Arial" w:hAnsi="Arial" w:cs="Arial"/>
+        </w:rPr>
+        <w:t xml:space="preserve"> that is used in the expression</w:t>
+      </w:r>
+      <w:r>
+        <w:rPr>
+          <w:rFonts w:ascii="Arial" w:hAnsi="Arial" w:cs="Arial"/>
+        </w:rPr>
+        <w:t>.</w:t>
+      </w:r>
+      <w:r>
+        <w:rPr>
+          <w:rFonts w:ascii="Arial" w:hAnsi="Arial" w:cs="Arial"/>
+        </w:rPr>
+        <w:t xml:space="preserve"> Its value should be a 32-bit integer as it will be used in the expression to evaluate the guard state.</w:t>
       </w:r>
     </w:p>
     <w:p>
@@ -1218,7 +1125,19 @@
         <w:rPr>
           <w:rFonts w:ascii="Arial" w:hAnsi="Arial" w:cs="Arial"/>
         </w:rPr>
-        <w:t xml:space="preserve"> A 32bit integer value for our expression. </w:t>
+        <w:t xml:space="preserve"> A 32</w:t>
+      </w:r>
+      <w:r>
+        <w:rPr>
+          <w:rFonts w:ascii="Arial" w:hAnsi="Arial" w:cs="Arial"/>
+        </w:rPr>
+        <w:t>-</w:t>
+      </w:r>
+      <w:r>
+        <w:rPr>
+          <w:rFonts w:ascii="Arial" w:hAnsi="Arial" w:cs="Arial"/>
+        </w:rPr>
+        <w:t xml:space="preserve">bit integer value for our expression. </w:t>
       </w:r>
     </w:p>
     <w:p>
@@ -1282,7 +1201,31 @@
         <w:rPr>
           <w:rFonts w:ascii="Arial" w:hAnsi="Arial" w:cs="Arial"/>
         </w:rPr>
-        <w:t xml:space="preserve"> How often should it be </w:t>
+        <w:t xml:space="preserve"> How often </w:t>
+      </w:r>
+      <w:r>
+        <w:rPr>
+          <w:rFonts w:ascii="Arial" w:hAnsi="Arial" w:cs="Arial"/>
+        </w:rPr>
+        <w:t>in minutes the guard</w:t>
+      </w:r>
+      <w:r>
+        <w:rPr>
+          <w:rFonts w:ascii="Arial" w:hAnsi="Arial" w:cs="Arial"/>
+        </w:rPr>
+        <w:t xml:space="preserve"> </w:t>
+      </w:r>
+      <w:r>
+        <w:rPr>
+          <w:rFonts w:ascii="Arial" w:hAnsi="Arial" w:cs="Arial"/>
+        </w:rPr>
+        <w:t>will</w:t>
+      </w:r>
+      <w:r>
+        <w:rPr>
+          <w:rFonts w:ascii="Arial" w:hAnsi="Arial" w:cs="Arial"/>
+        </w:rPr>
+        <w:t xml:space="preserve"> be </w:t>
       </w:r>
       <w:r>
         <w:rPr>
@@ -1402,7 +1345,19 @@
         <w:rPr>
           <w:rFonts w:ascii="Arial" w:hAnsi="Arial" w:cs="Arial"/>
         </w:rPr>
-        <w:t>guard before creation to ensure it can connect to the database, the query is valid and count column exists in the result set.</w:t>
+        <w:t xml:space="preserve">guard before creation to ensure it can connect to the database, the query is valid and </w:t>
+      </w:r>
+      <w:r>
+        <w:rPr>
+          <w:rFonts w:ascii="Arial" w:hAnsi="Arial" w:cs="Arial"/>
+        </w:rPr>
+        <w:t>trigger</w:t>
+      </w:r>
+      <w:r>
+        <w:rPr>
+          <w:rFonts w:ascii="Arial" w:hAnsi="Arial" w:cs="Arial"/>
+        </w:rPr>
+        <w:t xml:space="preserve"> column exists in the result set.</w:t>
       </w:r>
       <w:r>
         <w:rPr>
@@ -1447,7 +1402,43 @@
         <w:rPr>
           <w:rFonts w:ascii="Arial" w:hAnsi="Arial" w:cs="Arial"/>
         </w:rPr>
-        <w:t xml:space="preserve">For example, let’s say we want to be notified once a day if there are any customers in our database who have a debt that is more than $10.50. This is a good example to show that although the guard value is a 32bit integer, it can support monitoring decimals, dates, strings and many other data types since the logic is stored in the SQL </w:t>
+        <w:t>For example, let’s say we want to be notified once a day if there are any customers in our database who have a debt that is more than $10.50. This is a good example to show that although the guard</w:t>
+      </w:r>
+      <w:r>
+        <w:rPr>
+          <w:rFonts w:ascii="Arial" w:hAnsi="Arial" w:cs="Arial"/>
+        </w:rPr>
+        <w:t xml:space="preserve"> </w:t>
+      </w:r>
+      <w:r>
+        <w:rPr>
+          <w:rFonts w:ascii="Arial" w:hAnsi="Arial" w:cs="Arial"/>
+        </w:rPr>
+        <w:t>trigger</w:t>
+      </w:r>
+      <w:r>
+        <w:rPr>
+          <w:rFonts w:ascii="Arial" w:hAnsi="Arial" w:cs="Arial"/>
+        </w:rPr>
+        <w:t xml:space="preserve"> column</w:t>
+      </w:r>
+      <w:r>
+        <w:rPr>
+          <w:rFonts w:ascii="Arial" w:hAnsi="Arial" w:cs="Arial"/>
+        </w:rPr>
+        <w:t xml:space="preserve"> value is a 32</w:t>
+      </w:r>
+      <w:r>
+        <w:rPr>
+          <w:rFonts w:ascii="Arial" w:hAnsi="Arial" w:cs="Arial"/>
+        </w:rPr>
+        <w:t>-</w:t>
+      </w:r>
+      <w:r>
+        <w:rPr>
+          <w:rFonts w:ascii="Arial" w:hAnsi="Arial" w:cs="Arial"/>
+        </w:rPr>
+        <w:t xml:space="preserve">bit integer, it can support monitoring decimals, dates, strings and many other data types since the logic is stored in the SQL </w:t>
       </w:r>
       <w:r>
         <w:rPr>
@@ -1459,7 +1450,19 @@
         <w:rPr>
           <w:rFonts w:ascii="Arial" w:hAnsi="Arial" w:cs="Arial"/>
         </w:rPr>
-        <w:t xml:space="preserve"> and the application simply checks a sentinel value.</w:t>
+        <w:t xml:space="preserve"> and the application simply checks a </w:t>
+      </w:r>
+      <w:r>
+        <w:rPr>
+          <w:rFonts w:ascii="Arial" w:hAnsi="Arial" w:cs="Arial"/>
+        </w:rPr>
+        <w:t>trigger</w:t>
+      </w:r>
+      <w:r>
+        <w:rPr>
+          <w:rFonts w:ascii="Arial" w:hAnsi="Arial" w:cs="Arial"/>
+        </w:rPr>
+        <w:t xml:space="preserve"> value.</w:t>
       </w:r>
     </w:p>
     <w:p>
@@ -1494,97 +1497,49 @@
           <w:i/>
           <w:iCs/>
         </w:rPr>
-        <w:t xml:space="preserve">SELECT </w:t>
-      </w:r>
-      <w:proofErr w:type="gramStart"/>
+        <w:t xml:space="preserve">SELECT COUNT(*) as </w:t>
+      </w:r>
       <w:r>
         <w:rPr>
           <w:rFonts w:ascii="Arial" w:hAnsi="Arial" w:cs="Arial"/>
           <w:i/>
           <w:iCs/>
         </w:rPr>
-        <w:t>COUNT(</w:t>
-      </w:r>
-      <w:proofErr w:type="gramEnd"/>
-      <w:r>
+        <w:t>HighDebt</w:t>
+      </w:r>
+    </w:p>
+    <w:p>
+      <w:pPr>
         <w:rPr>
           <w:rFonts w:ascii="Arial" w:hAnsi="Arial" w:cs="Arial"/>
           <w:i/>
           <w:iCs/>
         </w:rPr>
-        <w:t>*) as Count</w:t>
-      </w:r>
-    </w:p>
-    <w:p>
-      <w:pPr>
+      </w:pPr>
+      <w:r>
         <w:rPr>
           <w:rFonts w:ascii="Arial" w:hAnsi="Arial" w:cs="Arial"/>
           <w:i/>
           <w:iCs/>
         </w:rPr>
-      </w:pPr>
-      <w:r>
+        <w:t>FROM customer_debt</w:t>
+      </w:r>
+    </w:p>
+    <w:p>
+      <w:pPr>
         <w:rPr>
           <w:rFonts w:ascii="Arial" w:hAnsi="Arial" w:cs="Arial"/>
           <w:i/>
           <w:iCs/>
         </w:rPr>
-        <w:t xml:space="preserve">FROM </w:t>
-      </w:r>
-      <w:proofErr w:type="spellStart"/>
+      </w:pPr>
       <w:r>
         <w:rPr>
           <w:rFonts w:ascii="Arial" w:hAnsi="Arial" w:cs="Arial"/>
           <w:i/>
           <w:iCs/>
         </w:rPr>
-        <w:t>customer_debt</w:t>
-      </w:r>
-      <w:proofErr w:type="spellEnd"/>
-    </w:p>
-    <w:p>
-      <w:pPr>
-        <w:rPr>
-          <w:rFonts w:ascii="Arial" w:hAnsi="Arial" w:cs="Arial"/>
-          <w:i/>
-          <w:iCs/>
-        </w:rPr>
-      </w:pPr>
-      <w:r>
-        <w:rPr>
-          <w:rFonts w:ascii="Arial" w:hAnsi="Arial" w:cs="Arial"/>
-          <w:i/>
-          <w:iCs/>
-        </w:rPr>
-        <w:t xml:space="preserve">WHERE </w:t>
-      </w:r>
-      <w:proofErr w:type="spellStart"/>
-      <w:r>
-        <w:rPr>
-          <w:rFonts w:ascii="Arial" w:hAnsi="Arial" w:cs="Arial"/>
-          <w:i/>
-          <w:iCs/>
-        </w:rPr>
-        <w:t>customer_</w:t>
-      </w:r>
-      <w:proofErr w:type="gramStart"/>
-      <w:r>
-        <w:rPr>
-          <w:rFonts w:ascii="Arial" w:hAnsi="Arial" w:cs="Arial"/>
-          <w:i/>
-          <w:iCs/>
-        </w:rPr>
-        <w:t>debt.dollars</w:t>
-      </w:r>
-      <w:proofErr w:type="spellEnd"/>
-      <w:proofErr w:type="gramEnd"/>
-      <w:r>
-        <w:rPr>
-          <w:rFonts w:ascii="Arial" w:hAnsi="Arial" w:cs="Arial"/>
-          <w:i/>
-          <w:iCs/>
-        </w:rPr>
-        <w:t xml:space="preserve"> &gt; 10.5;</w:t>
+        <w:t>WHERE customer_debt.dollars &gt; 10.5;</w:t>
       </w:r>
     </w:p>
     <w:p>
@@ -1602,7 +1557,46 @@
         <w:rPr>
           <w:rFonts w:ascii="Arial" w:hAnsi="Arial" w:cs="Arial"/>
         </w:rPr>
-        <w:t>The column we want to look at is called “Count” so the Count column will be “Count”.</w:t>
+        <w:lastRenderedPageBreak/>
+        <w:t>The column we want to look at is called “</w:t>
+      </w:r>
+      <w:r>
+        <w:rPr>
+          <w:rFonts w:ascii="Arial" w:hAnsi="Arial" w:cs="Arial"/>
+          <w:i/>
+          <w:iCs/>
+        </w:rPr>
+        <w:t>HighDebt</w:t>
+      </w:r>
+      <w:r>
+        <w:rPr>
+          <w:rFonts w:ascii="Arial" w:hAnsi="Arial" w:cs="Arial"/>
+        </w:rPr>
+        <w:t xml:space="preserve">” so the </w:t>
+      </w:r>
+      <w:r>
+        <w:rPr>
+          <w:rFonts w:ascii="Arial" w:hAnsi="Arial" w:cs="Arial"/>
+        </w:rPr>
+        <w:t>trigger</w:t>
+      </w:r>
+      <w:r>
+        <w:rPr>
+          <w:rFonts w:ascii="Arial" w:hAnsi="Arial" w:cs="Arial"/>
+        </w:rPr>
+        <w:t xml:space="preserve"> column will be “</w:t>
+      </w:r>
+      <w:r>
+        <w:rPr>
+          <w:rFonts w:ascii="Arial" w:hAnsi="Arial" w:cs="Arial"/>
+        </w:rPr>
+        <w:t>HighDebt</w:t>
+      </w:r>
+      <w:r>
+        <w:rPr>
+          <w:rFonts w:ascii="Arial" w:hAnsi="Arial" w:cs="Arial"/>
+        </w:rPr>
+        <w:t>”.</w:t>
       </w:r>
     </w:p>
     <w:p>
@@ -1620,7 +1614,19 @@
         <w:rPr>
           <w:rFonts w:ascii="Arial" w:hAnsi="Arial" w:cs="Arial"/>
         </w:rPr>
-        <w:t>Since the query uses “&gt;” our guard operator will be greater than or equal to.</w:t>
+        <w:t xml:space="preserve">Since the query uses “&gt;” our </w:t>
+      </w:r>
+      <w:r>
+        <w:rPr>
+          <w:rFonts w:ascii="Arial" w:hAnsi="Arial" w:cs="Arial"/>
+        </w:rPr>
+        <w:t>trigger</w:t>
+      </w:r>
+      <w:r>
+        <w:rPr>
+          <w:rFonts w:ascii="Arial" w:hAnsi="Arial" w:cs="Arial"/>
+        </w:rPr>
+        <w:t xml:space="preserve"> operator will be greater than or equal to.</w:t>
       </w:r>
     </w:p>
     <w:p>
@@ -1662,7 +1668,43 @@
         <w:rPr>
           <w:rFonts w:ascii="Arial" w:hAnsi="Arial" w:cs="Arial"/>
         </w:rPr>
-        <w:t>, trigger guard when “Count” in query is greater than 1.</w:t>
+        <w:t>, trigger guard when “</w:t>
+      </w:r>
+      <w:r>
+        <w:rPr>
+          <w:rFonts w:ascii="Arial" w:hAnsi="Arial" w:cs="Arial"/>
+        </w:rPr>
+        <w:t>HighDebt</w:t>
+      </w:r>
+      <w:r>
+        <w:rPr>
+          <w:rFonts w:ascii="Arial" w:hAnsi="Arial" w:cs="Arial"/>
+        </w:rPr>
+        <w:t>”</w:t>
+      </w:r>
+      <w:r>
+        <w:rPr>
+          <w:rFonts w:ascii="Arial" w:hAnsi="Arial" w:cs="Arial"/>
+        </w:rPr>
+        <w:t xml:space="preserve"> column</w:t>
+      </w:r>
+      <w:r>
+        <w:rPr>
+          <w:rFonts w:ascii="Arial" w:hAnsi="Arial" w:cs="Arial"/>
+        </w:rPr>
+        <w:t xml:space="preserve"> in query </w:t>
+      </w:r>
+      <w:r>
+        <w:rPr>
+          <w:rFonts w:ascii="Arial" w:hAnsi="Arial" w:cs="Arial"/>
+        </w:rPr>
+        <w:t xml:space="preserve">result </w:t>
+      </w:r>
+      <w:r>
+        <w:rPr>
+          <w:rFonts w:ascii="Arial" w:hAnsi="Arial" w:cs="Arial"/>
+        </w:rPr>
+        <w:t>is greater than 1.</w:t>
       </w:r>
     </w:p>
     <w:p>
@@ -1694,19 +1736,29 @@
         </w:rPr>
         <w:t xml:space="preserve"> we will set the run period in minutes to </w:t>
       </w:r>
-      <w:proofErr w:type="gramStart"/>
-      <w:r>
-        <w:rPr>
-          <w:rFonts w:ascii="Arial" w:hAnsi="Arial" w:cs="Arial"/>
-        </w:rPr>
-        <w:t>1440</w:t>
-      </w:r>
-      <w:proofErr w:type="gramEnd"/>
-      <w:r>
-        <w:rPr>
-          <w:rFonts w:ascii="Arial" w:hAnsi="Arial" w:cs="Arial"/>
-        </w:rPr>
-        <w:t xml:space="preserve"> so it runs every day.</w:t>
+      <w:r>
+        <w:rPr>
+          <w:rFonts w:ascii="Arial" w:hAnsi="Arial" w:cs="Arial"/>
+        </w:rPr>
+        <w:t>1440,</w:t>
+      </w:r>
+      <w:r>
+        <w:rPr>
+          <w:rFonts w:ascii="Arial" w:hAnsi="Arial" w:cs="Arial"/>
+        </w:rPr>
+        <w:t xml:space="preserve"> so it runs every </w:t>
+      </w:r>
+      <w:r>
+        <w:rPr>
+          <w:rFonts w:ascii="Arial" w:hAnsi="Arial" w:cs="Arial"/>
+        </w:rPr>
+        <w:t>24 hours</w:t>
+      </w:r>
+      <w:r>
+        <w:rPr>
+          <w:rFonts w:ascii="Arial" w:hAnsi="Arial" w:cs="Arial"/>
+        </w:rPr>
+        <w:t>.</w:t>
       </w:r>
     </w:p>
     <w:p>
@@ -1722,10 +1774,10 @@
         </w:rPr>
         <w:lastRenderedPageBreak/>
         <w:drawing>
-          <wp:inline distT="0" distB="0" distL="0" distR="0" wp14:anchorId="51A30F9E" wp14:editId="779AF9EF">
-            <wp:extent cx="2219635" cy="7487695"/>
-            <wp:effectExtent l="0" t="0" r="9525" b="0"/>
-            <wp:docPr id="1953619653" name="Picture 1"/>
+          <wp:inline distT="0" distB="0" distL="0" distR="0" wp14:anchorId="14995240" wp14:editId="58F52C54">
+            <wp:extent cx="2238687" cy="7478169"/>
+            <wp:effectExtent l="0" t="0" r="9525" b="8890"/>
+            <wp:docPr id="982974782" name="Picture 1"/>
             <wp:cNvGraphicFramePr>
               <a:graphicFrameLocks xmlns:a="http://schemas.openxmlformats.org/drawingml/2006/main" noChangeAspect="1"/>
             </wp:cNvGraphicFramePr>
@@ -1733,7 +1785,7 @@
               <a:graphicData uri="http://schemas.openxmlformats.org/drawingml/2006/picture">
                 <pic:pic xmlns:pic="http://schemas.openxmlformats.org/drawingml/2006/picture">
                   <pic:nvPicPr>
-                    <pic:cNvPr id="1953619653" name=""/>
+                    <pic:cNvPr id="982974782" name=""/>
                     <pic:cNvPicPr/>
                   </pic:nvPicPr>
                   <pic:blipFill>
@@ -1745,7 +1797,7 @@
                   <pic:spPr>
                     <a:xfrm>
                       <a:off x="0" y="0"/>
-                      <a:ext cx="2219635" cy="7487695"/>
+                      <a:ext cx="2238687" cy="7478169"/>
                     </a:xfrm>
                     <a:prstGeom prst="rect">
                       <a:avLst/>
@@ -2908,6 +2960,7 @@
   <w:style w:type="character" w:default="1" w:styleId="DefaultParagraphFont">
     <w:name w:val="Default Paragraph Font"/>
     <w:uiPriority w:val="1"/>
+    <w:semiHidden/>
     <w:unhideWhenUsed/>
   </w:style>
   <w:style w:type="table" w:default="1" w:styleId="TableNormal">
@@ -3482,9 +3535,12 @@
   </w:compat>
   <w:rsids>
     <w:rsidRoot w:val="007B161D"/>
+    <w:rsid w:val="00677E48"/>
+    <w:rsid w:val="00726275"/>
     <w:rsid w:val="007B161D"/>
     <w:rsid w:val="008C6D48"/>
     <w:rsid w:val="009200DD"/>
+    <w:rsid w:val="00C90C84"/>
   </w:rsids>
   <m:mathPr>
     <m:mathFont m:val="Cambria Math"/>
@@ -3935,10 +3991,6 @@
     <w:semiHidden/>
     <w:unhideWhenUsed/>
   </w:style>
-  <w:style w:type="paragraph" w:customStyle="1" w:styleId="CD4E4B188D4E42169839119FBC0635BE">
-    <w:name w:val="CD4E4B188D4E42169839119FBC0635BE"/>
-    <w:rsid w:val="007B161D"/>
-  </w:style>
   <w:style w:type="paragraph" w:customStyle="1" w:styleId="44D9402AA45F492DB8C61ADBEAA92338">
     <w:name w:val="44D9402AA45F492DB8C61ADBEAA92338"/>
     <w:rsid w:val="007B161D"/>

</xml_diff>

<commit_message>
Added more representative colors for guard change chart
</commit_message>
<xml_diff>
--- a/Documentation/DBGuard user-manual.docx
+++ b/Documentation/DBGuard user-manual.docx
@@ -323,7 +323,19 @@
         <w:rPr>
           <w:rFonts w:ascii="Arial" w:hAnsi="Arial" w:cs="Arial"/>
         </w:rPr>
-        <w:t>DBGuard (Database Guard) is an application that periodically checks the state of your databases and sends notifications when specific conditions are met. It is useful for catching bad or unexpected data that could cause applications to crash, or for alerting a team when data meets any criteria that warrants attention.</w:t>
+        <w:t xml:space="preserve">DBGuard (Database Guard) is an application that periodically checks the state of your databases and sends notifications when specific conditions are met. It is useful for catching bad or unexpected data that </w:t>
+      </w:r>
+      <w:r>
+        <w:rPr>
+          <w:rFonts w:ascii="Arial" w:hAnsi="Arial" w:cs="Arial"/>
+        </w:rPr>
+        <w:t>can</w:t>
+      </w:r>
+      <w:r>
+        <w:rPr>
+          <w:rFonts w:ascii="Arial" w:hAnsi="Arial" w:cs="Arial"/>
+        </w:rPr>
+        <w:t xml:space="preserve"> cause applications to crash, or for alerting a team when data meets any criteria that warrants attention.</w:t>
       </w:r>
     </w:p>
     <w:p>
@@ -349,7 +361,55 @@
         <w:rPr>
           <w:rFonts w:ascii="Arial" w:hAnsi="Arial" w:cs="Arial"/>
         </w:rPr>
-        <w:t>Monitoring is performed through Guards — each Guard runs a user-defined SQL query on a periodic schedule and compares the result to a user-defined expression. Because the core logic is written in SQL, the application remains decoupled and straightforward to configure.</w:t>
+        <w:t xml:space="preserve">Monitoring is performed through Guards — each Guard runs a user-defined SQL query on a periodic schedule and compares the result to a user-defined expression. </w:t>
+      </w:r>
+      <w:r>
+        <w:rPr>
+          <w:rFonts w:ascii="Arial" w:hAnsi="Arial" w:cs="Arial"/>
+        </w:rPr>
+        <w:t>Since</w:t>
+      </w:r>
+      <w:r>
+        <w:rPr>
+          <w:rFonts w:ascii="Arial" w:hAnsi="Arial" w:cs="Arial"/>
+        </w:rPr>
+        <w:t xml:space="preserve"> the core logic</w:t>
+      </w:r>
+      <w:r>
+        <w:rPr>
+          <w:rFonts w:ascii="Arial" w:hAnsi="Arial" w:cs="Arial"/>
+        </w:rPr>
+        <w:t xml:space="preserve"> and business rules</w:t>
+      </w:r>
+      <w:r>
+        <w:rPr>
+          <w:rFonts w:ascii="Arial" w:hAnsi="Arial" w:cs="Arial"/>
+        </w:rPr>
+        <w:t xml:space="preserve"> </w:t>
+      </w:r>
+      <w:r>
+        <w:rPr>
+          <w:rFonts w:ascii="Arial" w:hAnsi="Arial" w:cs="Arial"/>
+        </w:rPr>
+        <w:t>are</w:t>
+      </w:r>
+      <w:r>
+        <w:rPr>
+          <w:rFonts w:ascii="Arial" w:hAnsi="Arial" w:cs="Arial"/>
+        </w:rPr>
+        <w:t xml:space="preserve"> written in SQL, the application remains decoupled and </w:t>
+      </w:r>
+      <w:r>
+        <w:rPr>
+          <w:rFonts w:ascii="Arial" w:hAnsi="Arial" w:cs="Arial"/>
+        </w:rPr>
+        <w:t>simple</w:t>
+      </w:r>
+      <w:r>
+        <w:rPr>
+          <w:rFonts w:ascii="Arial" w:hAnsi="Arial" w:cs="Arial"/>
+        </w:rPr>
+        <w:t xml:space="preserve"> to configure.</w:t>
       </w:r>
     </w:p>
     <w:p>
@@ -421,7 +481,13 @@
           <w:rFonts w:ascii="Arial" w:hAnsi="Arial" w:cs="Arial"/>
         </w:rPr>
         <w:lastRenderedPageBreak/>
-        <w:t>Creating A Guard</w:t>
+        <w:t>Guard</w:t>
+      </w:r>
+      <w:r>
+        <w:rPr>
+          <w:rFonts w:ascii="Arial" w:hAnsi="Arial" w:cs="Arial"/>
+        </w:rPr>
+        <w:t>s</w:t>
       </w:r>
     </w:p>
     <w:p>
@@ -436,20 +502,6 @@
           <w:rFonts w:ascii="Arial" w:hAnsi="Arial" w:cs="Arial"/>
         </w:rPr>
         <w:t>Understanding a guard</w:t>
-      </w:r>
-    </w:p>
-    <w:p>
-      <w:pPr>
-        <w:pStyle w:val="Heading3"/>
-        <w:rPr>
-          <w:rFonts w:ascii="Arial" w:hAnsi="Arial" w:cs="Arial"/>
-        </w:rPr>
-      </w:pPr>
-      <w:r>
-        <w:rPr>
-          <w:rFonts w:ascii="Arial" w:hAnsi="Arial" w:cs="Arial"/>
-        </w:rPr>
-        <w:t>Guard</w:t>
       </w:r>
     </w:p>
     <w:p>
@@ -613,16 +665,22 @@
     </w:p>
     <w:p>
       <w:pPr>
-        <w:pStyle w:val="Heading3"/>
-        <w:rPr>
-          <w:rFonts w:ascii="Arial" w:hAnsi="Arial" w:cs="Arial"/>
-        </w:rPr>
-      </w:pPr>
-      <w:r>
-        <w:rPr>
-          <w:rFonts w:ascii="Arial" w:hAnsi="Arial" w:cs="Arial"/>
-        </w:rPr>
-        <w:t>Database connection</w:t>
+        <w:pStyle w:val="Heading2"/>
+        <w:rPr>
+          <w:rFonts w:ascii="Arial" w:hAnsi="Arial" w:cs="Arial"/>
+        </w:rPr>
+      </w:pPr>
+      <w:r>
+        <w:rPr>
+          <w:rFonts w:ascii="Arial" w:hAnsi="Arial" w:cs="Arial"/>
+        </w:rPr>
+        <w:t>Guard d</w:t>
+      </w:r>
+      <w:r>
+        <w:rPr>
+          <w:rFonts w:ascii="Arial" w:hAnsi="Arial" w:cs="Arial"/>
+        </w:rPr>
+        <w:t>atabase connection</w:t>
       </w:r>
     </w:p>
     <w:p>
@@ -676,7 +734,7 @@
     </w:p>
     <w:p>
       <w:pPr>
-        <w:pStyle w:val="Heading3"/>
+        <w:pStyle w:val="Heading2"/>
         <w:rPr>
           <w:rFonts w:ascii="Arial" w:hAnsi="Arial" w:cs="Arial"/>
         </w:rPr>
@@ -741,13 +799,6 @@
         </w:rPr>
         <w:t>Select the “+Guard” button on the toolbar:</w:t>
       </w:r>
-    </w:p>
-    <w:p>
-      <w:pPr>
-        <w:rPr>
-          <w:rFonts w:ascii="Arial" w:hAnsi="Arial" w:cs="Arial"/>
-        </w:rPr>
-      </w:pPr>
     </w:p>
     <w:p>
       <w:pPr>
@@ -777,7 +828,7 @@
                     <pic:cNvPicPr/>
                   </pic:nvPicPr>
                   <pic:blipFill>
-                    <a:blip r:embed="rId6"/>
+                    <a:blip r:embed="rId8"/>
                     <a:stretch>
                       <a:fillRect/>
                     </a:stretch>
@@ -844,7 +895,7 @@
                     <pic:cNvPicPr/>
                   </pic:nvPicPr>
                   <pic:blipFill>
-                    <a:blip r:embed="rId7"/>
+                    <a:blip r:embed="rId9"/>
                     <a:stretch>
                       <a:fillRect/>
                     </a:stretch>
@@ -1357,13 +1408,7 @@
         <w:rPr>
           <w:rFonts w:ascii="Arial" w:hAnsi="Arial" w:cs="Arial"/>
         </w:rPr>
-        <w:t xml:space="preserve"> column exists in the result set.</w:t>
-      </w:r>
-      <w:r>
-        <w:rPr>
-          <w:rFonts w:ascii="Arial" w:hAnsi="Arial" w:cs="Arial"/>
-        </w:rPr>
-        <w:t xml:space="preserve"> Will return an error with failure if it is invalid.</w:t>
+        <w:t xml:space="preserve"> column exists in the result set. Will return an error with failure if it is invalid.</w:t>
       </w:r>
     </w:p>
     <w:p>
@@ -1386,9 +1431,15 @@
     </w:p>
     <w:p>
       <w:pPr>
-        <w:pStyle w:val="Heading3"/>
-      </w:pPr>
-      <w:r>
+        <w:pStyle w:val="Heading2"/>
+        <w:rPr>
+          <w:rFonts w:ascii="Arial" w:hAnsi="Arial" w:cs="Arial"/>
+        </w:rPr>
+      </w:pPr>
+      <w:r>
+        <w:rPr>
+          <w:rFonts w:ascii="Arial" w:hAnsi="Arial" w:cs="Arial"/>
+        </w:rPr>
         <w:t>Example guard</w:t>
       </w:r>
     </w:p>
@@ -1789,7 +1840,7 @@
                     <pic:cNvPicPr/>
                   </pic:nvPicPr>
                   <pic:blipFill>
-                    <a:blip r:embed="rId8"/>
+                    <a:blip r:embed="rId10"/>
                     <a:stretch>
                       <a:fillRect/>
                     </a:stretch>
@@ -1810,6 +1861,693 @@
         </w:drawing>
       </w:r>
     </w:p>
+    <w:p>
+      <w:pPr>
+        <w:pStyle w:val="Heading2"/>
+      </w:pPr>
+      <w:r>
+        <w:lastRenderedPageBreak/>
+        <w:t>View guards</w:t>
+      </w:r>
+    </w:p>
+    <w:p>
+      <w:r>
+        <w:t>You can view the created guards by selecting the “View guards” navigation on the sidebar or navigating to “/guards/view-all”.</w:t>
+      </w:r>
+    </w:p>
+    <w:p>
+      <w:r>
+        <w:t>The header includes a sort by selection and a filter button to filter and sort your guards. Additionally, you can use the paginator on the bottom to change the view count.</w:t>
+      </w:r>
+    </w:p>
+    <w:p>
+      <w:r>
+        <w:t>The view-all webpage displays a summary of the most important information for the guard. You can select the guard’s name to view its details.</w:t>
+      </w:r>
+    </w:p>
+    <w:p>
+      <w:pPr>
+        <w:jc w:val="center"/>
+      </w:pPr>
+      <w:r>
+        <w:drawing>
+          <wp:inline distT="0" distB="0" distL="0" distR="0" wp14:anchorId="7A7AA4C4" wp14:editId="71B14DC5">
+            <wp:extent cx="4839419" cy="1807027"/>
+            <wp:effectExtent l="0" t="0" r="0" b="3175"/>
+            <wp:docPr id="561217107" name="Picture 1"/>
+            <wp:cNvGraphicFramePr>
+              <a:graphicFrameLocks xmlns:a="http://schemas.openxmlformats.org/drawingml/2006/main" noChangeAspect="1"/>
+            </wp:cNvGraphicFramePr>
+            <a:graphic xmlns:a="http://schemas.openxmlformats.org/drawingml/2006/main">
+              <a:graphicData uri="http://schemas.openxmlformats.org/drawingml/2006/picture">
+                <pic:pic xmlns:pic="http://schemas.openxmlformats.org/drawingml/2006/picture">
+                  <pic:nvPicPr>
+                    <pic:cNvPr id="561217107" name=""/>
+                    <pic:cNvPicPr/>
+                  </pic:nvPicPr>
+                  <pic:blipFill>
+                    <a:blip r:embed="rId11"/>
+                    <a:stretch>
+                      <a:fillRect/>
+                    </a:stretch>
+                  </pic:blipFill>
+                  <pic:spPr>
+                    <a:xfrm>
+                      <a:off x="0" y="0"/>
+                      <a:ext cx="4852912" cy="1812065"/>
+                    </a:xfrm>
+                    <a:prstGeom prst="rect">
+                      <a:avLst/>
+                    </a:prstGeom>
+                  </pic:spPr>
+                </pic:pic>
+              </a:graphicData>
+            </a:graphic>
+          </wp:inline>
+        </w:drawing>
+      </w:r>
+    </w:p>
+    <w:p>
+      <w:r>
+        <w:t>Selecting the guard’s name link navigates you to “/guards/detail/:id”. It displays The details of the guard, its database connection, its configured notifications, the guard state change history, and guard notification transactions sent. Many of the properties are links which can be used to navigate to other detail pages:</w:t>
+      </w:r>
+    </w:p>
+    <w:p>
+      <w:r>
+        <w:t>Link to database connection detail:</w:t>
+      </w:r>
+    </w:p>
+    <w:p>
+      <w:pPr>
+        <w:jc w:val="center"/>
+      </w:pPr>
+      <w:r>
+        <w:drawing>
+          <wp:inline distT="0" distB="0" distL="0" distR="0" wp14:anchorId="43E5936E" wp14:editId="13382F43">
+            <wp:extent cx="4304581" cy="885290"/>
+            <wp:effectExtent l="0" t="0" r="1270" b="0"/>
+            <wp:docPr id="992549301" name="Picture 1"/>
+            <wp:cNvGraphicFramePr>
+              <a:graphicFrameLocks xmlns:a="http://schemas.openxmlformats.org/drawingml/2006/main" noChangeAspect="1"/>
+            </wp:cNvGraphicFramePr>
+            <a:graphic xmlns:a="http://schemas.openxmlformats.org/drawingml/2006/main">
+              <a:graphicData uri="http://schemas.openxmlformats.org/drawingml/2006/picture">
+                <pic:pic xmlns:pic="http://schemas.openxmlformats.org/drawingml/2006/picture">
+                  <pic:nvPicPr>
+                    <pic:cNvPr id="992549301" name=""/>
+                    <pic:cNvPicPr/>
+                  </pic:nvPicPr>
+                  <pic:blipFill>
+                    <a:blip r:embed="rId12"/>
+                    <a:stretch>
+                      <a:fillRect/>
+                    </a:stretch>
+                  </pic:blipFill>
+                  <pic:spPr>
+                    <a:xfrm>
+                      <a:off x="0" y="0"/>
+                      <a:ext cx="4342186" cy="893024"/>
+                    </a:xfrm>
+                    <a:prstGeom prst="rect">
+                      <a:avLst/>
+                    </a:prstGeom>
+                  </pic:spPr>
+                </pic:pic>
+              </a:graphicData>
+            </a:graphic>
+          </wp:inline>
+        </w:drawing>
+      </w:r>
+    </w:p>
+    <w:p>
+      <w:r>
+        <w:t>Link to guard change detail:</w:t>
+      </w:r>
+    </w:p>
+    <w:p>
+      <w:pPr>
+        <w:jc w:val="center"/>
+      </w:pPr>
+      <w:r>
+        <w:drawing>
+          <wp:inline distT="0" distB="0" distL="0" distR="0" wp14:anchorId="67EF8E73" wp14:editId="56C1EB7A">
+            <wp:extent cx="4270075" cy="905566"/>
+            <wp:effectExtent l="0" t="0" r="0" b="8890"/>
+            <wp:docPr id="364832495" name="Picture 1"/>
+            <wp:cNvGraphicFramePr>
+              <a:graphicFrameLocks xmlns:a="http://schemas.openxmlformats.org/drawingml/2006/main" noChangeAspect="1"/>
+            </wp:cNvGraphicFramePr>
+            <a:graphic xmlns:a="http://schemas.openxmlformats.org/drawingml/2006/main">
+              <a:graphicData uri="http://schemas.openxmlformats.org/drawingml/2006/picture">
+                <pic:pic xmlns:pic="http://schemas.openxmlformats.org/drawingml/2006/picture">
+                  <pic:nvPicPr>
+                    <pic:cNvPr id="364832495" name=""/>
+                    <pic:cNvPicPr/>
+                  </pic:nvPicPr>
+                  <pic:blipFill>
+                    <a:blip r:embed="rId13"/>
+                    <a:stretch>
+                      <a:fillRect/>
+                    </a:stretch>
+                  </pic:blipFill>
+                  <pic:spPr>
+                    <a:xfrm>
+                      <a:off x="0" y="0"/>
+                      <a:ext cx="4283047" cy="908317"/>
+                    </a:xfrm>
+                    <a:prstGeom prst="rect">
+                      <a:avLst/>
+                    </a:prstGeom>
+                  </pic:spPr>
+                </pic:pic>
+              </a:graphicData>
+            </a:graphic>
+          </wp:inline>
+        </w:drawing>
+      </w:r>
+    </w:p>
+    <w:p>
+      <w:pPr>
+        <w:pStyle w:val="Heading1"/>
+        <w:rPr>
+          <w:rFonts w:ascii="Arial" w:hAnsi="Arial" w:cs="Arial"/>
+        </w:rPr>
+      </w:pPr>
+      <w:r>
+        <w:rPr>
+          <w:rFonts w:ascii="Arial" w:hAnsi="Arial" w:cs="Arial"/>
+        </w:rPr>
+        <w:t>Database connections</w:t>
+      </w:r>
+    </w:p>
+    <w:p>
+      <w:pPr>
+        <w:pStyle w:val="Heading2"/>
+        <w:rPr>
+          <w:rFonts w:ascii="Arial" w:hAnsi="Arial" w:cs="Arial"/>
+        </w:rPr>
+      </w:pPr>
+      <w:r>
+        <w:rPr>
+          <w:rFonts w:ascii="Arial" w:hAnsi="Arial" w:cs="Arial"/>
+        </w:rPr>
+        <w:t>Understanding a database connection</w:t>
+      </w:r>
+    </w:p>
+    <w:p>
+      <w:pPr>
+        <w:rPr>
+          <w:rFonts w:ascii="Arial" w:hAnsi="Arial" w:cs="Arial"/>
+        </w:rPr>
+      </w:pPr>
+      <w:r>
+        <w:rPr>
+          <w:rFonts w:ascii="Arial" w:hAnsi="Arial" w:cs="Arial"/>
+        </w:rPr>
+        <w:t>A database connection is used by the guard to connect to the database. You can share the database connections between multiple guards. The guards should have read-only permissions to the database, schema, or table.</w:t>
+      </w:r>
+    </w:p>
+    <w:p>
+      <w:pPr>
+        <w:rPr>
+          <w:rFonts w:ascii="Arial" w:hAnsi="Arial" w:cs="Arial"/>
+        </w:rPr>
+      </w:pPr>
+      <w:r>
+        <w:rPr>
+          <w:rFonts w:ascii="Arial" w:hAnsi="Arial" w:cs="Arial"/>
+        </w:rPr>
+        <w:t>Some database engines such as SQLite do not use servers or user logins. For these, you instead specify the path of the database and can leave the username and password empty.</w:t>
+      </w:r>
+    </w:p>
+    <w:p>
+      <w:pPr>
+        <w:pStyle w:val="Heading2"/>
+      </w:pPr>
+      <w:r>
+        <w:t>Create a database connection</w:t>
+      </w:r>
+    </w:p>
+    <w:p>
+      <w:pPr>
+        <w:pStyle w:val="ListParagraph"/>
+        <w:numPr>
+          <w:ilvl w:val="0"/>
+          <w:numId w:val="6"/>
+        </w:numPr>
+      </w:pPr>
+      <w:r>
+        <w:t>You can create a database connection by selecting the + button in the guard creation dialog:</w:t>
+      </w:r>
+    </w:p>
+    <w:p>
+      <w:pPr>
+        <w:ind w:left="360"/>
+      </w:pPr>
+      <w:r>
+        <w:drawing>
+          <wp:inline distT="0" distB="0" distL="0" distR="0" wp14:anchorId="79C7CB03" wp14:editId="00C4251C">
+            <wp:extent cx="4029637" cy="1724266"/>
+            <wp:effectExtent l="0" t="0" r="0" b="9525"/>
+            <wp:docPr id="1034822219" name="Picture 1"/>
+            <wp:cNvGraphicFramePr>
+              <a:graphicFrameLocks xmlns:a="http://schemas.openxmlformats.org/drawingml/2006/main" noChangeAspect="1"/>
+            </wp:cNvGraphicFramePr>
+            <a:graphic xmlns:a="http://schemas.openxmlformats.org/drawingml/2006/main">
+              <a:graphicData uri="http://schemas.openxmlformats.org/drawingml/2006/picture">
+                <pic:pic xmlns:pic="http://schemas.openxmlformats.org/drawingml/2006/picture">
+                  <pic:nvPicPr>
+                    <pic:cNvPr id="1034822219" name=""/>
+                    <pic:cNvPicPr/>
+                  </pic:nvPicPr>
+                  <pic:blipFill>
+                    <a:blip r:embed="rId14"/>
+                    <a:stretch>
+                      <a:fillRect/>
+                    </a:stretch>
+                  </pic:blipFill>
+                  <pic:spPr>
+                    <a:xfrm>
+                      <a:off x="0" y="0"/>
+                      <a:ext cx="4029637" cy="1724266"/>
+                    </a:xfrm>
+                    <a:prstGeom prst="rect">
+                      <a:avLst/>
+                    </a:prstGeom>
+                  </pic:spPr>
+                </pic:pic>
+              </a:graphicData>
+            </a:graphic>
+          </wp:inline>
+        </w:drawing>
+      </w:r>
+    </w:p>
+    <w:p>
+      <w:pPr>
+        <w:pStyle w:val="ListParagraph"/>
+        <w:numPr>
+          <w:ilvl w:val="0"/>
+          <w:numId w:val="6"/>
+        </w:numPr>
+      </w:pPr>
+      <w:r>
+        <w:t>Alternatively, you can navigate to “/db-connections/view-all” or select “View connections” from the sidebar.</w:t>
+      </w:r>
+    </w:p>
+    <w:p>
+      <w:pPr>
+        <w:pStyle w:val="ListParagraph"/>
+        <w:numPr>
+          <w:ilvl w:val="0"/>
+          <w:numId w:val="6"/>
+        </w:numPr>
+      </w:pPr>
+      <w:r>
+        <w:t>You will see the creation dialog appear:</w:t>
+      </w:r>
+    </w:p>
+    <w:p>
+      <w:pPr>
+        <w:ind w:left="360"/>
+        <w:jc w:val="center"/>
+      </w:pPr>
+      <w:r>
+        <w:drawing>
+          <wp:inline distT="0" distB="0" distL="0" distR="0" wp14:anchorId="347B81AE" wp14:editId="4B2FE3C0">
+            <wp:extent cx="3467819" cy="4957698"/>
+            <wp:effectExtent l="0" t="0" r="0" b="0"/>
+            <wp:docPr id="139490495" name="Picture 1"/>
+            <wp:cNvGraphicFramePr>
+              <a:graphicFrameLocks xmlns:a="http://schemas.openxmlformats.org/drawingml/2006/main" noChangeAspect="1"/>
+            </wp:cNvGraphicFramePr>
+            <a:graphic xmlns:a="http://schemas.openxmlformats.org/drawingml/2006/main">
+              <a:graphicData uri="http://schemas.openxmlformats.org/drawingml/2006/picture">
+                <pic:pic xmlns:pic="http://schemas.openxmlformats.org/drawingml/2006/picture">
+                  <pic:nvPicPr>
+                    <pic:cNvPr id="139490495" name=""/>
+                    <pic:cNvPicPr/>
+                  </pic:nvPicPr>
+                  <pic:blipFill>
+                    <a:blip r:embed="rId15"/>
+                    <a:stretch>
+                      <a:fillRect/>
+                    </a:stretch>
+                  </pic:blipFill>
+                  <pic:spPr>
+                    <a:xfrm>
+                      <a:off x="0" y="0"/>
+                      <a:ext cx="3469240" cy="4959730"/>
+                    </a:xfrm>
+                    <a:prstGeom prst="rect">
+                      <a:avLst/>
+                    </a:prstGeom>
+                  </pic:spPr>
+                </pic:pic>
+              </a:graphicData>
+            </a:graphic>
+          </wp:inline>
+        </w:drawing>
+      </w:r>
+    </w:p>
+    <w:p>
+      <w:pPr>
+        <w:pStyle w:val="ListParagraph"/>
+        <w:numPr>
+          <w:ilvl w:val="0"/>
+          <w:numId w:val="6"/>
+        </w:numPr>
+      </w:pPr>
+      <w:r>
+        <w:t xml:space="preserve">Here is what each of the fields </w:t>
+      </w:r>
+      <w:r>
+        <w:t>mean:</w:t>
+      </w:r>
+    </w:p>
+    <w:p>
+      <w:pPr>
+        <w:pStyle w:val="ListParagraph"/>
+        <w:numPr>
+          <w:ilvl w:val="1"/>
+          <w:numId w:val="8"/>
+        </w:numPr>
+      </w:pPr>
+      <w:r>
+        <w:rPr>
+          <w:b/>
+          <w:bCs/>
+        </w:rPr>
+        <w:t>Endpoint</w:t>
+      </w:r>
+      <w:r>
+        <w:t xml:space="preserve">: The hostname, </w:t>
+      </w:r>
+      <w:r>
+        <w:t>IP Address</w:t>
+      </w:r>
+      <w:r>
+        <w:t xml:space="preserve"> or system path to the server or database file</w:t>
+      </w:r>
+    </w:p>
+    <w:p>
+      <w:pPr>
+        <w:pStyle w:val="ListParagraph"/>
+        <w:numPr>
+          <w:ilvl w:val="1"/>
+          <w:numId w:val="8"/>
+        </w:numPr>
+      </w:pPr>
+      <w:r>
+        <w:rPr>
+          <w:b/>
+          <w:bCs/>
+        </w:rPr>
+        <w:t>Database Engine</w:t>
+      </w:r>
+      <w:r>
+        <w:t>: The database engine type.</w:t>
+      </w:r>
+    </w:p>
+    <w:p>
+      <w:pPr>
+        <w:pStyle w:val="ListParagraph"/>
+        <w:numPr>
+          <w:ilvl w:val="1"/>
+          <w:numId w:val="8"/>
+        </w:numPr>
+      </w:pPr>
+      <w:r>
+        <w:rPr>
+          <w:b/>
+          <w:bCs/>
+        </w:rPr>
+        <w:t>Database name</w:t>
+      </w:r>
+      <w:r>
+        <w:t>: The database or database file name.</w:t>
+      </w:r>
+    </w:p>
+    <w:p>
+      <w:pPr>
+        <w:pStyle w:val="ListParagraph"/>
+        <w:numPr>
+          <w:ilvl w:val="1"/>
+          <w:numId w:val="8"/>
+        </w:numPr>
+      </w:pPr>
+      <w:r>
+        <w:rPr>
+          <w:b/>
+          <w:bCs/>
+        </w:rPr>
+        <w:t>Username</w:t>
+      </w:r>
+      <w:r>
+        <w:t>: The database username if applicable.</w:t>
+      </w:r>
+    </w:p>
+    <w:p>
+      <w:pPr>
+        <w:pStyle w:val="ListParagraph"/>
+        <w:numPr>
+          <w:ilvl w:val="1"/>
+          <w:numId w:val="8"/>
+        </w:numPr>
+      </w:pPr>
+      <w:r>
+        <w:rPr>
+          <w:b/>
+          <w:bCs/>
+        </w:rPr>
+        <w:t>Password</w:t>
+      </w:r>
+      <w:r>
+        <w:t>: The database password if applicable.</w:t>
+      </w:r>
+    </w:p>
+    <w:p>
+      <w:pPr>
+        <w:pStyle w:val="ListParagraph"/>
+        <w:numPr>
+          <w:ilvl w:val="1"/>
+          <w:numId w:val="8"/>
+        </w:numPr>
+      </w:pPr>
+      <w:r>
+        <w:rPr>
+          <w:b/>
+          <w:bCs/>
+        </w:rPr>
+        <w:t>Validate connection</w:t>
+      </w:r>
+      <w:r>
+        <w:t>: Will validate the service can connect to the database server or can find the database file.</w:t>
+      </w:r>
+    </w:p>
+    <w:p>
+      <w:pPr>
+        <w:pStyle w:val="Heading2"/>
+      </w:pPr>
+      <w:r>
+        <w:t>Examples</w:t>
+      </w:r>
+    </w:p>
+    <w:p>
+      <w:pPr>
+        <w:pStyle w:val="Heading3"/>
+      </w:pPr>
+      <w:r>
+        <w:t>Local database server</w:t>
+      </w:r>
+    </w:p>
+    <w:p>
+      <w:pPr>
+        <w:pStyle w:val="ListParagraph"/>
+        <w:numPr>
+          <w:ilvl w:val="0"/>
+          <w:numId w:val="10"/>
+        </w:numPr>
+      </w:pPr>
+      <w:r>
+        <w:t>Endpoint: 10.55.48.112</w:t>
+      </w:r>
+    </w:p>
+    <w:p>
+      <w:pPr>
+        <w:pStyle w:val="ListParagraph"/>
+        <w:numPr>
+          <w:ilvl w:val="0"/>
+          <w:numId w:val="10"/>
+        </w:numPr>
+      </w:pPr>
+      <w:r>
+        <w:t>Database Engine: PostgreSQL</w:t>
+      </w:r>
+    </w:p>
+    <w:p>
+      <w:pPr>
+        <w:pStyle w:val="ListParagraph"/>
+        <w:numPr>
+          <w:ilvl w:val="0"/>
+          <w:numId w:val="10"/>
+        </w:numPr>
+      </w:pPr>
+      <w:r>
+        <w:t>Database Name: Demo</w:t>
+      </w:r>
+    </w:p>
+    <w:p>
+      <w:pPr>
+        <w:pStyle w:val="ListParagraph"/>
+        <w:numPr>
+          <w:ilvl w:val="0"/>
+          <w:numId w:val="10"/>
+        </w:numPr>
+      </w:pPr>
+      <w:r>
+        <w:t>Username: read-only</w:t>
+      </w:r>
+    </w:p>
+    <w:p>
+      <w:pPr>
+        <w:pStyle w:val="ListParagraph"/>
+        <w:numPr>
+          <w:ilvl w:val="0"/>
+          <w:numId w:val="10"/>
+        </w:numPr>
+      </w:pPr>
+      <w:r>
+        <w:t>Password: Password1</w:t>
+      </w:r>
+    </w:p>
+    <w:p>
+      <w:pPr>
+        <w:pStyle w:val="Heading3"/>
+      </w:pPr>
+      <w:r>
+        <w:t>Remote database server</w:t>
+      </w:r>
+    </w:p>
+    <w:p>
+      <w:pPr>
+        <w:pStyle w:val="ListParagraph"/>
+        <w:numPr>
+          <w:ilvl w:val="0"/>
+          <w:numId w:val="11"/>
+        </w:numPr>
+      </w:pPr>
+      <w:r>
+        <w:t>Endpoint: ssms.website.net</w:t>
+      </w:r>
+    </w:p>
+    <w:p>
+      <w:pPr>
+        <w:pStyle w:val="ListParagraph"/>
+        <w:numPr>
+          <w:ilvl w:val="0"/>
+          <w:numId w:val="11"/>
+        </w:numPr>
+      </w:pPr>
+      <w:r>
+        <w:t>Database Engine: SQL Server</w:t>
+      </w:r>
+    </w:p>
+    <w:p>
+      <w:pPr>
+        <w:pStyle w:val="ListParagraph"/>
+        <w:numPr>
+          <w:ilvl w:val="0"/>
+          <w:numId w:val="11"/>
+        </w:numPr>
+      </w:pPr>
+      <w:r>
+        <w:t>Database Name: Demo</w:t>
+      </w:r>
+    </w:p>
+    <w:p>
+      <w:pPr>
+        <w:pStyle w:val="ListParagraph"/>
+        <w:numPr>
+          <w:ilvl w:val="0"/>
+          <w:numId w:val="11"/>
+        </w:numPr>
+      </w:pPr>
+      <w:r>
+        <w:t>Username: read-only</w:t>
+      </w:r>
+    </w:p>
+    <w:p>
+      <w:pPr>
+        <w:pStyle w:val="ListParagraph"/>
+        <w:numPr>
+          <w:ilvl w:val="0"/>
+          <w:numId w:val="11"/>
+        </w:numPr>
+      </w:pPr>
+      <w:r>
+        <w:t>Password: Password1</w:t>
+      </w:r>
+    </w:p>
+    <w:p>
+      <w:pPr>
+        <w:pStyle w:val="Heading3"/>
+      </w:pPr>
+      <w:r>
+        <w:t>Local database file</w:t>
+      </w:r>
+    </w:p>
+    <w:p>
+      <w:pPr>
+        <w:pStyle w:val="ListParagraph"/>
+        <w:numPr>
+          <w:ilvl w:val="0"/>
+          <w:numId w:val="12"/>
+        </w:numPr>
+      </w:pPr>
+      <w:r>
+        <w:t xml:space="preserve">Endpoint: </w:t>
+      </w:r>
+      <w:r>
+        <w:t>C:\Users\</w:t>
+      </w:r>
+      <w:r>
+        <w:t>Leo</w:t>
+      </w:r>
+      <w:r>
+        <w:t>\Downloads\d</w:t>
+      </w:r>
+      <w:r>
+        <w:t>atabase</w:t>
+      </w:r>
+      <w:r>
+        <w:t>.db</w:t>
+      </w:r>
+    </w:p>
+    <w:p>
+      <w:pPr>
+        <w:pStyle w:val="ListParagraph"/>
+        <w:numPr>
+          <w:ilvl w:val="0"/>
+          <w:numId w:val="12"/>
+        </w:numPr>
+      </w:pPr>
+      <w:r>
+        <w:t>Database: SQLite</w:t>
+      </w:r>
+    </w:p>
+    <w:p>
+      <w:pPr>
+        <w:pStyle w:val="ListParagraph"/>
+        <w:numPr>
+          <w:ilvl w:val="0"/>
+          <w:numId w:val="12"/>
+        </w:numPr>
+      </w:pPr>
+      <w:r>
+        <w:t>Database Name: database.db</w:t>
+      </w:r>
+    </w:p>
+    <w:p/>
     <w:sectPr>
       <w:pgSz w:w="12240" w:h="15840"/>
       <w:pgMar w:top="1440" w:right="1440" w:bottom="1440" w:left="1440" w:header="720" w:footer="720" w:gutter="0"/>
@@ -1822,9 +2560,261 @@
 </w:document>
 </file>
 
+<file path=word/endnotes.xml><?xml version="1.0" encoding="utf-8"?>
+<w:endnotes xmlns:wpc="http://schemas.microsoft.com/office/word/2010/wordprocessingCanvas" xmlns:cx="http://schemas.microsoft.com/office/drawing/2014/chartex" xmlns:cx1="http://schemas.microsoft.com/office/drawing/2015/9/8/chartex" xmlns:cx2="http://schemas.microsoft.com/office/drawing/2015/10/21/chartex" xmlns:cx3="http://schemas.microsoft.com/office/drawing/2016/5/9/chartex" xmlns:cx4="http://schemas.microsoft.com/office/drawing/2016/5/10/chartex" xmlns:cx5="http://schemas.microsoft.com/office/drawing/2016/5/11/chartex" xmlns:cx6="http://schemas.microsoft.com/office/drawing/2016/5/12/chartex" xmlns:cx7="http://schemas.microsoft.com/office/drawing/2016/5/13/chartex" xmlns:cx8="http://schemas.microsoft.com/office/drawing/2016/5/14/chartex" xmlns:mc="http://schemas.openxmlformats.org/markup-compatibility/2006" xmlns:aink="http://schemas.microsoft.com/office/drawing/2016/ink" xmlns:am3d="http://schemas.microsoft.com/office/drawing/2017/model3d" xmlns:o="urn:schemas-microsoft-com:office:office" xmlns:oel="http://schemas.microsoft.com/office/2019/extlst" xmlns:r="http://schemas.openxmlformats.org/officeDocument/2006/relationships" xmlns:m="http://schemas.openxmlformats.org/officeDocument/2006/math" xmlns:v="urn:schemas-microsoft-com:vml" xmlns:wp14="http://schemas.microsoft.com/office/word/2010/wordprocessingDrawing" xmlns:wp="http://schemas.openxmlformats.org/drawingml/2006/wordprocessingDrawing" xmlns:w10="urn:schemas-microsoft-com:office:word" xmlns:w="http://schemas.openxmlformats.org/wordprocessingml/2006/main" xmlns:w14="http://schemas.microsoft.com/office/word/2010/wordml" xmlns:w15="http://schemas.microsoft.com/office/word/2012/wordml" xmlns:w16cex="http://schemas.microsoft.com/office/word/2018/wordml/cex" xmlns:w16cid="http://schemas.microsoft.com/office/word/2016/wordml/cid" xmlns:w16="http://schemas.microsoft.com/office/word/2018/wordml" xmlns:w16du="http://schemas.microsoft.com/office/word/2023/wordml/word16du" xmlns:w16sdtdh="http://schemas.microsoft.com/office/word/2020/wordml/sdtdatahash" xmlns:w16sdtfl="http://schemas.microsoft.com/office/word/2024/wordml/sdtformatlock" xmlns:w16se="http://schemas.microsoft.com/office/word/2015/wordml/symex" xmlns:wpg="http://schemas.microsoft.com/office/word/2010/wordprocessingGroup" xmlns:wpi="http://schemas.microsoft.com/office/word/2010/wordprocessingInk" xmlns:wne="http://schemas.microsoft.com/office/word/2006/wordml" xmlns:wps="http://schemas.microsoft.com/office/word/2010/wordprocessingShape" mc:Ignorable="w14 w15 w16se w16cid w16 w16cex w16sdtdh w16sdtfl w16du wp14">
+  <w:endnote w:type="separator" w:id="-1">
+    <w:p>
+      <w:pPr>
+        <w:spacing w:after="0" w:line="240" w:lineRule="auto"/>
+      </w:pPr>
+      <w:r>
+        <w:separator/>
+      </w:r>
+    </w:p>
+  </w:endnote>
+  <w:endnote w:type="continuationSeparator" w:id="0">
+    <w:p>
+      <w:pPr>
+        <w:spacing w:after="0" w:line="240" w:lineRule="auto"/>
+      </w:pPr>
+      <w:r>
+        <w:continuationSeparator/>
+      </w:r>
+    </w:p>
+  </w:endnote>
+</w:endnotes>
+</file>
+
+<file path=word/footnotes.xml><?xml version="1.0" encoding="utf-8"?>
+<w:footnotes xmlns:wpc="http://schemas.microsoft.com/office/word/2010/wordprocessingCanvas" xmlns:cx="http://schemas.microsoft.com/office/drawing/2014/chartex" xmlns:cx1="http://schemas.microsoft.com/office/drawing/2015/9/8/chartex" xmlns:cx2="http://schemas.microsoft.com/office/drawing/2015/10/21/chartex" xmlns:cx3="http://schemas.microsoft.com/office/drawing/2016/5/9/chartex" xmlns:cx4="http://schemas.microsoft.com/office/drawing/2016/5/10/chartex" xmlns:cx5="http://schemas.microsoft.com/office/drawing/2016/5/11/chartex" xmlns:cx6="http://schemas.microsoft.com/office/drawing/2016/5/12/chartex" xmlns:cx7="http://schemas.microsoft.com/office/drawing/2016/5/13/chartex" xmlns:cx8="http://schemas.microsoft.com/office/drawing/2016/5/14/chartex" xmlns:mc="http://schemas.openxmlformats.org/markup-compatibility/2006" xmlns:aink="http://schemas.microsoft.com/office/drawing/2016/ink" xmlns:am3d="http://schemas.microsoft.com/office/drawing/2017/model3d" xmlns:o="urn:schemas-microsoft-com:office:office" xmlns:oel="http://schemas.microsoft.com/office/2019/extlst" xmlns:r="http://schemas.openxmlformats.org/officeDocument/2006/relationships" xmlns:m="http://schemas.openxmlformats.org/officeDocument/2006/math" xmlns:v="urn:schemas-microsoft-com:vml" xmlns:wp14="http://schemas.microsoft.com/office/word/2010/wordprocessingDrawing" xmlns:wp="http://schemas.openxmlformats.org/drawingml/2006/wordprocessingDrawing" xmlns:w10="urn:schemas-microsoft-com:office:word" xmlns:w="http://schemas.openxmlformats.org/wordprocessingml/2006/main" xmlns:w14="http://schemas.microsoft.com/office/word/2010/wordml" xmlns:w15="http://schemas.microsoft.com/office/word/2012/wordml" xmlns:w16cex="http://schemas.microsoft.com/office/word/2018/wordml/cex" xmlns:w16cid="http://schemas.microsoft.com/office/word/2016/wordml/cid" xmlns:w16="http://schemas.microsoft.com/office/word/2018/wordml" xmlns:w16du="http://schemas.microsoft.com/office/word/2023/wordml/word16du" xmlns:w16sdtdh="http://schemas.microsoft.com/office/word/2020/wordml/sdtdatahash" xmlns:w16sdtfl="http://schemas.microsoft.com/office/word/2024/wordml/sdtformatlock" xmlns:w16se="http://schemas.microsoft.com/office/word/2015/wordml/symex" xmlns:wpg="http://schemas.microsoft.com/office/word/2010/wordprocessingGroup" xmlns:wpi="http://schemas.microsoft.com/office/word/2010/wordprocessingInk" xmlns:wne="http://schemas.microsoft.com/office/word/2006/wordml" xmlns:wps="http://schemas.microsoft.com/office/word/2010/wordprocessingShape" mc:Ignorable="w14 w15 w16se w16cid w16 w16cex w16sdtdh w16sdtfl w16du wp14">
+  <w:footnote w:type="separator" w:id="-1">
+    <w:p>
+      <w:pPr>
+        <w:spacing w:after="0" w:line="240" w:lineRule="auto"/>
+      </w:pPr>
+      <w:r>
+        <w:separator/>
+      </w:r>
+    </w:p>
+  </w:footnote>
+  <w:footnote w:type="continuationSeparator" w:id="0">
+    <w:p>
+      <w:pPr>
+        <w:spacing w:after="0" w:line="240" w:lineRule="auto"/>
+      </w:pPr>
+      <w:r>
+        <w:continuationSeparator/>
+      </w:r>
+    </w:p>
+  </w:footnote>
+</w:footnotes>
+</file>
+
 <file path=word/numbering.xml><?xml version="1.0" encoding="utf-8"?>
 <w:numbering xmlns:wpc="http://schemas.microsoft.com/office/word/2010/wordprocessingCanvas" xmlns:cx="http://schemas.microsoft.com/office/drawing/2014/chartex" xmlns:cx1="http://schemas.microsoft.com/office/drawing/2015/9/8/chartex" xmlns:cx2="http://schemas.microsoft.com/office/drawing/2015/10/21/chartex" xmlns:cx3="http://schemas.microsoft.com/office/drawing/2016/5/9/chartex" xmlns:cx4="http://schemas.microsoft.com/office/drawing/2016/5/10/chartex" xmlns:cx5="http://schemas.microsoft.com/office/drawing/2016/5/11/chartex" xmlns:cx6="http://schemas.microsoft.com/office/drawing/2016/5/12/chartex" xmlns:cx7="http://schemas.microsoft.com/office/drawing/2016/5/13/chartex" xmlns:cx8="http://schemas.microsoft.com/office/drawing/2016/5/14/chartex" xmlns:mc="http://schemas.openxmlformats.org/markup-compatibility/2006" xmlns:aink="http://schemas.microsoft.com/office/drawing/2016/ink" xmlns:am3d="http://schemas.microsoft.com/office/drawing/2017/model3d" xmlns:o="urn:schemas-microsoft-com:office:office" xmlns:oel="http://schemas.microsoft.com/office/2019/extlst" xmlns:r="http://schemas.openxmlformats.org/officeDocument/2006/relationships" xmlns:m="http://schemas.openxmlformats.org/officeDocument/2006/math" xmlns:v="urn:schemas-microsoft-com:vml" xmlns:wp14="http://schemas.microsoft.com/office/word/2010/wordprocessingDrawing" xmlns:wp="http://schemas.openxmlformats.org/drawingml/2006/wordprocessingDrawing" xmlns:w10="urn:schemas-microsoft-com:office:word" xmlns:w="http://schemas.openxmlformats.org/wordprocessingml/2006/main" xmlns:w14="http://schemas.microsoft.com/office/word/2010/wordml" xmlns:w15="http://schemas.microsoft.com/office/word/2012/wordml" xmlns:w16cex="http://schemas.microsoft.com/office/word/2018/wordml/cex" xmlns:w16cid="http://schemas.microsoft.com/office/word/2016/wordml/cid" xmlns:w16="http://schemas.microsoft.com/office/word/2018/wordml" xmlns:w16du="http://schemas.microsoft.com/office/word/2023/wordml/word16du" xmlns:w16sdtdh="http://schemas.microsoft.com/office/word/2020/wordml/sdtdatahash" xmlns:w16sdtfl="http://schemas.microsoft.com/office/word/2024/wordml/sdtformatlock" xmlns:w16se="http://schemas.microsoft.com/office/word/2015/wordml/symex" xmlns:wpg="http://schemas.microsoft.com/office/word/2010/wordprocessingGroup" xmlns:wpi="http://schemas.microsoft.com/office/word/2010/wordprocessingInk" xmlns:wne="http://schemas.microsoft.com/office/word/2006/wordml" xmlns:wps="http://schemas.microsoft.com/office/word/2010/wordprocessingShape" mc:Ignorable="w14 w15 w16se w16cid w16 w16cex w16sdtdh w16sdtfl w16du wp14">
   <w:abstractNum w:abstractNumId="0" w15:restartNumberingAfterBreak="0">
+    <w:nsid w:val="003E0A37"/>
+    <w:multiLevelType w:val="hybridMultilevel"/>
+    <w:tmpl w:val="8842DC90"/>
+    <w:lvl w:ilvl="0" w:tplc="FFFFFFFF">
+      <w:start w:val="1"/>
+      <w:numFmt w:val="decimal"/>
+      <w:lvlText w:val="%1."/>
+      <w:lvlJc w:val="left"/>
+      <w:pPr>
+        <w:ind w:left="720" w:hanging="360"/>
+      </w:pPr>
+    </w:lvl>
+    <w:lvl w:ilvl="1" w:tplc="04090003">
+      <w:start w:val="1"/>
+      <w:numFmt w:val="bullet"/>
+      <w:lvlText w:val="o"/>
+      <w:lvlJc w:val="left"/>
+      <w:pPr>
+        <w:ind w:left="1440" w:hanging="360"/>
+      </w:pPr>
+      <w:rPr>
+        <w:rFonts w:ascii="Courier New" w:hAnsi="Courier New" w:cs="Courier New" w:hint="default"/>
+      </w:rPr>
+    </w:lvl>
+    <w:lvl w:ilvl="2" w:tplc="FFFFFFFF" w:tentative="1">
+      <w:start w:val="1"/>
+      <w:numFmt w:val="lowerRoman"/>
+      <w:lvlText w:val="%3."/>
+      <w:lvlJc w:val="right"/>
+      <w:pPr>
+        <w:ind w:left="2160" w:hanging="180"/>
+      </w:pPr>
+    </w:lvl>
+    <w:lvl w:ilvl="3" w:tplc="FFFFFFFF" w:tentative="1">
+      <w:start w:val="1"/>
+      <w:numFmt w:val="decimal"/>
+      <w:lvlText w:val="%4."/>
+      <w:lvlJc w:val="left"/>
+      <w:pPr>
+        <w:ind w:left="2880" w:hanging="360"/>
+      </w:pPr>
+    </w:lvl>
+    <w:lvl w:ilvl="4" w:tplc="FFFFFFFF" w:tentative="1">
+      <w:start w:val="1"/>
+      <w:numFmt w:val="lowerLetter"/>
+      <w:lvlText w:val="%5."/>
+      <w:lvlJc w:val="left"/>
+      <w:pPr>
+        <w:ind w:left="3600" w:hanging="360"/>
+      </w:pPr>
+    </w:lvl>
+    <w:lvl w:ilvl="5" w:tplc="FFFFFFFF" w:tentative="1">
+      <w:start w:val="1"/>
+      <w:numFmt w:val="lowerRoman"/>
+      <w:lvlText w:val="%6."/>
+      <w:lvlJc w:val="right"/>
+      <w:pPr>
+        <w:ind w:left="4320" w:hanging="180"/>
+      </w:pPr>
+    </w:lvl>
+    <w:lvl w:ilvl="6" w:tplc="FFFFFFFF" w:tentative="1">
+      <w:start w:val="1"/>
+      <w:numFmt w:val="decimal"/>
+      <w:lvlText w:val="%7."/>
+      <w:lvlJc w:val="left"/>
+      <w:pPr>
+        <w:ind w:left="5040" w:hanging="360"/>
+      </w:pPr>
+    </w:lvl>
+    <w:lvl w:ilvl="7" w:tplc="FFFFFFFF" w:tentative="1">
+      <w:start w:val="1"/>
+      <w:numFmt w:val="lowerLetter"/>
+      <w:lvlText w:val="%8."/>
+      <w:lvlJc w:val="left"/>
+      <w:pPr>
+        <w:ind w:left="5760" w:hanging="360"/>
+      </w:pPr>
+    </w:lvl>
+    <w:lvl w:ilvl="8" w:tplc="FFFFFFFF" w:tentative="1">
+      <w:start w:val="1"/>
+      <w:numFmt w:val="lowerRoman"/>
+      <w:lvlText w:val="%9."/>
+      <w:lvlJc w:val="right"/>
+      <w:pPr>
+        <w:ind w:left="6480" w:hanging="180"/>
+      </w:pPr>
+    </w:lvl>
+  </w:abstractNum>
+  <w:abstractNum w:abstractNumId="1" w15:restartNumberingAfterBreak="0">
+    <w:nsid w:val="052468C6"/>
+    <w:multiLevelType w:val="hybridMultilevel"/>
+    <w:tmpl w:val="9782D396"/>
+    <w:lvl w:ilvl="0" w:tplc="04090001">
+      <w:start w:val="1"/>
+      <w:numFmt w:val="bullet"/>
+      <w:lvlText w:val=""/>
+      <w:lvlJc w:val="left"/>
+      <w:pPr>
+        <w:ind w:left="720" w:hanging="360"/>
+      </w:pPr>
+      <w:rPr>
+        <w:rFonts w:ascii="Symbol" w:hAnsi="Symbol" w:hint="default"/>
+      </w:rPr>
+    </w:lvl>
+    <w:lvl w:ilvl="1" w:tplc="04090003" w:tentative="1">
+      <w:start w:val="1"/>
+      <w:numFmt w:val="bullet"/>
+      <w:lvlText w:val="o"/>
+      <w:lvlJc w:val="left"/>
+      <w:pPr>
+        <w:ind w:left="1440" w:hanging="360"/>
+      </w:pPr>
+      <w:rPr>
+        <w:rFonts w:ascii="Courier New" w:hAnsi="Courier New" w:cs="Courier New" w:hint="default"/>
+      </w:rPr>
+    </w:lvl>
+    <w:lvl w:ilvl="2" w:tplc="04090005" w:tentative="1">
+      <w:start w:val="1"/>
+      <w:numFmt w:val="bullet"/>
+      <w:lvlText w:val=""/>
+      <w:lvlJc w:val="left"/>
+      <w:pPr>
+        <w:ind w:left="2160" w:hanging="360"/>
+      </w:pPr>
+      <w:rPr>
+        <w:rFonts w:ascii="Wingdings" w:hAnsi="Wingdings" w:hint="default"/>
+      </w:rPr>
+    </w:lvl>
+    <w:lvl w:ilvl="3" w:tplc="04090001" w:tentative="1">
+      <w:start w:val="1"/>
+      <w:numFmt w:val="bullet"/>
+      <w:lvlText w:val=""/>
+      <w:lvlJc w:val="left"/>
+      <w:pPr>
+        <w:ind w:left="2880" w:hanging="360"/>
+      </w:pPr>
+      <w:rPr>
+        <w:rFonts w:ascii="Symbol" w:hAnsi="Symbol" w:hint="default"/>
+      </w:rPr>
+    </w:lvl>
+    <w:lvl w:ilvl="4" w:tplc="04090003" w:tentative="1">
+      <w:start w:val="1"/>
+      <w:numFmt w:val="bullet"/>
+      <w:lvlText w:val="o"/>
+      <w:lvlJc w:val="left"/>
+      <w:pPr>
+        <w:ind w:left="3600" w:hanging="360"/>
+      </w:pPr>
+      <w:rPr>
+        <w:rFonts w:ascii="Courier New" w:hAnsi="Courier New" w:cs="Courier New" w:hint="default"/>
+      </w:rPr>
+    </w:lvl>
+    <w:lvl w:ilvl="5" w:tplc="04090005" w:tentative="1">
+      <w:start w:val="1"/>
+      <w:numFmt w:val="bullet"/>
+      <w:lvlText w:val=""/>
+      <w:lvlJc w:val="left"/>
+      <w:pPr>
+        <w:ind w:left="4320" w:hanging="360"/>
+      </w:pPr>
+      <w:rPr>
+        <w:rFonts w:ascii="Wingdings" w:hAnsi="Wingdings" w:hint="default"/>
+      </w:rPr>
+    </w:lvl>
+    <w:lvl w:ilvl="6" w:tplc="04090001" w:tentative="1">
+      <w:start w:val="1"/>
+      <w:numFmt w:val="bullet"/>
+      <w:lvlText w:val=""/>
+      <w:lvlJc w:val="left"/>
+      <w:pPr>
+        <w:ind w:left="5040" w:hanging="360"/>
+      </w:pPr>
+      <w:rPr>
+        <w:rFonts w:ascii="Symbol" w:hAnsi="Symbol" w:hint="default"/>
+      </w:rPr>
+    </w:lvl>
+    <w:lvl w:ilvl="7" w:tplc="04090003" w:tentative="1">
+      <w:start w:val="1"/>
+      <w:numFmt w:val="bullet"/>
+      <w:lvlText w:val="o"/>
+      <w:lvlJc w:val="left"/>
+      <w:pPr>
+        <w:ind w:left="5760" w:hanging="360"/>
+      </w:pPr>
+      <w:rPr>
+        <w:rFonts w:ascii="Courier New" w:hAnsi="Courier New" w:cs="Courier New" w:hint="default"/>
+      </w:rPr>
+    </w:lvl>
+    <w:lvl w:ilvl="8" w:tplc="04090005" w:tentative="1">
+      <w:start w:val="1"/>
+      <w:numFmt w:val="bullet"/>
+      <w:lvlText w:val=""/>
+      <w:lvlJc w:val="left"/>
+      <w:pPr>
+        <w:ind w:left="6480" w:hanging="360"/>
+      </w:pPr>
+      <w:rPr>
+        <w:rFonts w:ascii="Wingdings" w:hAnsi="Wingdings" w:hint="default"/>
+      </w:rPr>
+    </w:lvl>
+  </w:abstractNum>
+  <w:abstractNum w:abstractNumId="2" w15:restartNumberingAfterBreak="0">
     <w:nsid w:val="0DEE0AC4"/>
     <w:multiLevelType w:val="hybridMultilevel"/>
     <w:tmpl w:val="6756B93A"/>
@@ -1913,7 +2903,120 @@
       </w:pPr>
     </w:lvl>
   </w:abstractNum>
-  <w:abstractNum w:abstractNumId="1" w15:restartNumberingAfterBreak="0">
+  <w:abstractNum w:abstractNumId="3" w15:restartNumberingAfterBreak="0">
+    <w:nsid w:val="156A2F51"/>
+    <w:multiLevelType w:val="hybridMultilevel"/>
+    <w:tmpl w:val="FC56256E"/>
+    <w:lvl w:ilvl="0" w:tplc="04090001">
+      <w:start w:val="1"/>
+      <w:numFmt w:val="bullet"/>
+      <w:lvlText w:val=""/>
+      <w:lvlJc w:val="left"/>
+      <w:pPr>
+        <w:ind w:left="720" w:hanging="360"/>
+      </w:pPr>
+      <w:rPr>
+        <w:rFonts w:ascii="Symbol" w:hAnsi="Symbol" w:hint="default"/>
+      </w:rPr>
+    </w:lvl>
+    <w:lvl w:ilvl="1" w:tplc="FFFFFFFF" w:tentative="1">
+      <w:start w:val="1"/>
+      <w:numFmt w:val="bullet"/>
+      <w:lvlText w:val="o"/>
+      <w:lvlJc w:val="left"/>
+      <w:pPr>
+        <w:ind w:left="1440" w:hanging="360"/>
+      </w:pPr>
+      <w:rPr>
+        <w:rFonts w:ascii="Courier New" w:hAnsi="Courier New" w:cs="Courier New" w:hint="default"/>
+      </w:rPr>
+    </w:lvl>
+    <w:lvl w:ilvl="2" w:tplc="FFFFFFFF" w:tentative="1">
+      <w:start w:val="1"/>
+      <w:numFmt w:val="bullet"/>
+      <w:lvlText w:val=""/>
+      <w:lvlJc w:val="left"/>
+      <w:pPr>
+        <w:ind w:left="2160" w:hanging="360"/>
+      </w:pPr>
+      <w:rPr>
+        <w:rFonts w:ascii="Wingdings" w:hAnsi="Wingdings" w:hint="default"/>
+      </w:rPr>
+    </w:lvl>
+    <w:lvl w:ilvl="3" w:tplc="FFFFFFFF" w:tentative="1">
+      <w:start w:val="1"/>
+      <w:numFmt w:val="bullet"/>
+      <w:lvlText w:val=""/>
+      <w:lvlJc w:val="left"/>
+      <w:pPr>
+        <w:ind w:left="2880" w:hanging="360"/>
+      </w:pPr>
+      <w:rPr>
+        <w:rFonts w:ascii="Symbol" w:hAnsi="Symbol" w:hint="default"/>
+      </w:rPr>
+    </w:lvl>
+    <w:lvl w:ilvl="4" w:tplc="FFFFFFFF" w:tentative="1">
+      <w:start w:val="1"/>
+      <w:numFmt w:val="bullet"/>
+      <w:lvlText w:val="o"/>
+      <w:lvlJc w:val="left"/>
+      <w:pPr>
+        <w:ind w:left="3600" w:hanging="360"/>
+      </w:pPr>
+      <w:rPr>
+        <w:rFonts w:ascii="Courier New" w:hAnsi="Courier New" w:cs="Courier New" w:hint="default"/>
+      </w:rPr>
+    </w:lvl>
+    <w:lvl w:ilvl="5" w:tplc="FFFFFFFF" w:tentative="1">
+      <w:start w:val="1"/>
+      <w:numFmt w:val="bullet"/>
+      <w:lvlText w:val=""/>
+      <w:lvlJc w:val="left"/>
+      <w:pPr>
+        <w:ind w:left="4320" w:hanging="360"/>
+      </w:pPr>
+      <w:rPr>
+        <w:rFonts w:ascii="Wingdings" w:hAnsi="Wingdings" w:hint="default"/>
+      </w:rPr>
+    </w:lvl>
+    <w:lvl w:ilvl="6" w:tplc="FFFFFFFF" w:tentative="1">
+      <w:start w:val="1"/>
+      <w:numFmt w:val="bullet"/>
+      <w:lvlText w:val=""/>
+      <w:lvlJc w:val="left"/>
+      <w:pPr>
+        <w:ind w:left="5040" w:hanging="360"/>
+      </w:pPr>
+      <w:rPr>
+        <w:rFonts w:ascii="Symbol" w:hAnsi="Symbol" w:hint="default"/>
+      </w:rPr>
+    </w:lvl>
+    <w:lvl w:ilvl="7" w:tplc="FFFFFFFF" w:tentative="1">
+      <w:start w:val="1"/>
+      <w:numFmt w:val="bullet"/>
+      <w:lvlText w:val="o"/>
+      <w:lvlJc w:val="left"/>
+      <w:pPr>
+        <w:ind w:left="5760" w:hanging="360"/>
+      </w:pPr>
+      <w:rPr>
+        <w:rFonts w:ascii="Courier New" w:hAnsi="Courier New" w:cs="Courier New" w:hint="default"/>
+      </w:rPr>
+    </w:lvl>
+    <w:lvl w:ilvl="8" w:tplc="FFFFFFFF" w:tentative="1">
+      <w:start w:val="1"/>
+      <w:numFmt w:val="bullet"/>
+      <w:lvlText w:val=""/>
+      <w:lvlJc w:val="left"/>
+      <w:pPr>
+        <w:ind w:left="6480" w:hanging="360"/>
+      </w:pPr>
+      <w:rPr>
+        <w:rFonts w:ascii="Wingdings" w:hAnsi="Wingdings" w:hint="default"/>
+      </w:rPr>
+    </w:lvl>
+  </w:abstractNum>
+  <w:abstractNum w:abstractNumId="4" w15:restartNumberingAfterBreak="0">
     <w:nsid w:val="175128EC"/>
     <w:multiLevelType w:val="hybridMultilevel"/>
     <w:tmpl w:val="5DDC3668"/>
@@ -2026,7 +3129,209 @@
       </w:rPr>
     </w:lvl>
   </w:abstractNum>
-  <w:abstractNum w:abstractNumId="2" w15:restartNumberingAfterBreak="0">
+  <w:abstractNum w:abstractNumId="5" w15:restartNumberingAfterBreak="0">
+    <w:nsid w:val="36B63142"/>
+    <w:multiLevelType w:val="hybridMultilevel"/>
+    <w:tmpl w:val="D438E70C"/>
+    <w:lvl w:ilvl="0" w:tplc="04090003">
+      <w:start w:val="1"/>
+      <w:numFmt w:val="bullet"/>
+      <w:lvlText w:val="o"/>
+      <w:lvlJc w:val="left"/>
+      <w:pPr>
+        <w:ind w:left="720" w:hanging="360"/>
+      </w:pPr>
+      <w:rPr>
+        <w:rFonts w:ascii="Courier New" w:hAnsi="Courier New" w:cs="Courier New" w:hint="default"/>
+      </w:rPr>
+    </w:lvl>
+    <w:lvl w:ilvl="1" w:tplc="04090003" w:tentative="1">
+      <w:start w:val="1"/>
+      <w:numFmt w:val="bullet"/>
+      <w:lvlText w:val="o"/>
+      <w:lvlJc w:val="left"/>
+      <w:pPr>
+        <w:ind w:left="1440" w:hanging="360"/>
+      </w:pPr>
+      <w:rPr>
+        <w:rFonts w:ascii="Courier New" w:hAnsi="Courier New" w:cs="Courier New" w:hint="default"/>
+      </w:rPr>
+    </w:lvl>
+    <w:lvl w:ilvl="2" w:tplc="04090005" w:tentative="1">
+      <w:start w:val="1"/>
+      <w:numFmt w:val="bullet"/>
+      <w:lvlText w:val=""/>
+      <w:lvlJc w:val="left"/>
+      <w:pPr>
+        <w:ind w:left="2160" w:hanging="360"/>
+      </w:pPr>
+      <w:rPr>
+        <w:rFonts w:ascii="Wingdings" w:hAnsi="Wingdings" w:hint="default"/>
+      </w:rPr>
+    </w:lvl>
+    <w:lvl w:ilvl="3" w:tplc="04090001" w:tentative="1">
+      <w:start w:val="1"/>
+      <w:numFmt w:val="bullet"/>
+      <w:lvlText w:val=""/>
+      <w:lvlJc w:val="left"/>
+      <w:pPr>
+        <w:ind w:left="2880" w:hanging="360"/>
+      </w:pPr>
+      <w:rPr>
+        <w:rFonts w:ascii="Symbol" w:hAnsi="Symbol" w:hint="default"/>
+      </w:rPr>
+    </w:lvl>
+    <w:lvl w:ilvl="4" w:tplc="04090003" w:tentative="1">
+      <w:start w:val="1"/>
+      <w:numFmt w:val="bullet"/>
+      <w:lvlText w:val="o"/>
+      <w:lvlJc w:val="left"/>
+      <w:pPr>
+        <w:ind w:left="3600" w:hanging="360"/>
+      </w:pPr>
+      <w:rPr>
+        <w:rFonts w:ascii="Courier New" w:hAnsi="Courier New" w:cs="Courier New" w:hint="default"/>
+      </w:rPr>
+    </w:lvl>
+    <w:lvl w:ilvl="5" w:tplc="04090005" w:tentative="1">
+      <w:start w:val="1"/>
+      <w:numFmt w:val="bullet"/>
+      <w:lvlText w:val=""/>
+      <w:lvlJc w:val="left"/>
+      <w:pPr>
+        <w:ind w:left="4320" w:hanging="360"/>
+      </w:pPr>
+      <w:rPr>
+        <w:rFonts w:ascii="Wingdings" w:hAnsi="Wingdings" w:hint="default"/>
+      </w:rPr>
+    </w:lvl>
+    <w:lvl w:ilvl="6" w:tplc="04090001" w:tentative="1">
+      <w:start w:val="1"/>
+      <w:numFmt w:val="bullet"/>
+      <w:lvlText w:val=""/>
+      <w:lvlJc w:val="left"/>
+      <w:pPr>
+        <w:ind w:left="5040" w:hanging="360"/>
+      </w:pPr>
+      <w:rPr>
+        <w:rFonts w:ascii="Symbol" w:hAnsi="Symbol" w:hint="default"/>
+      </w:rPr>
+    </w:lvl>
+    <w:lvl w:ilvl="7" w:tplc="04090003" w:tentative="1">
+      <w:start w:val="1"/>
+      <w:numFmt w:val="bullet"/>
+      <w:lvlText w:val="o"/>
+      <w:lvlJc w:val="left"/>
+      <w:pPr>
+        <w:ind w:left="5760" w:hanging="360"/>
+      </w:pPr>
+      <w:rPr>
+        <w:rFonts w:ascii="Courier New" w:hAnsi="Courier New" w:cs="Courier New" w:hint="default"/>
+      </w:rPr>
+    </w:lvl>
+    <w:lvl w:ilvl="8" w:tplc="04090005" w:tentative="1">
+      <w:start w:val="1"/>
+      <w:numFmt w:val="bullet"/>
+      <w:lvlText w:val=""/>
+      <w:lvlJc w:val="left"/>
+      <w:pPr>
+        <w:ind w:left="6480" w:hanging="360"/>
+      </w:pPr>
+      <w:rPr>
+        <w:rFonts w:ascii="Wingdings" w:hAnsi="Wingdings" w:hint="default"/>
+      </w:rPr>
+    </w:lvl>
+  </w:abstractNum>
+  <w:abstractNum w:abstractNumId="6" w15:restartNumberingAfterBreak="0">
+    <w:nsid w:val="521D65AD"/>
+    <w:multiLevelType w:val="hybridMultilevel"/>
+    <w:tmpl w:val="FA16E5AA"/>
+    <w:lvl w:ilvl="0" w:tplc="FFFFFFFF">
+      <w:start w:val="1"/>
+      <w:numFmt w:val="decimal"/>
+      <w:lvlText w:val="%1."/>
+      <w:lvlJc w:val="left"/>
+      <w:pPr>
+        <w:ind w:left="720" w:hanging="360"/>
+      </w:pPr>
+    </w:lvl>
+    <w:lvl w:ilvl="1" w:tplc="04090001">
+      <w:start w:val="1"/>
+      <w:numFmt w:val="bullet"/>
+      <w:lvlText w:val=""/>
+      <w:lvlJc w:val="left"/>
+      <w:pPr>
+        <w:ind w:left="720" w:hanging="360"/>
+      </w:pPr>
+      <w:rPr>
+        <w:rFonts w:ascii="Symbol" w:hAnsi="Symbol" w:hint="default"/>
+      </w:rPr>
+    </w:lvl>
+    <w:lvl w:ilvl="2" w:tplc="FFFFFFFF" w:tentative="1">
+      <w:start w:val="1"/>
+      <w:numFmt w:val="lowerRoman"/>
+      <w:lvlText w:val="%3."/>
+      <w:lvlJc w:val="right"/>
+      <w:pPr>
+        <w:ind w:left="2160" w:hanging="180"/>
+      </w:pPr>
+    </w:lvl>
+    <w:lvl w:ilvl="3" w:tplc="FFFFFFFF" w:tentative="1">
+      <w:start w:val="1"/>
+      <w:numFmt w:val="decimal"/>
+      <w:lvlText w:val="%4."/>
+      <w:lvlJc w:val="left"/>
+      <w:pPr>
+        <w:ind w:left="2880" w:hanging="360"/>
+      </w:pPr>
+    </w:lvl>
+    <w:lvl w:ilvl="4" w:tplc="FFFFFFFF" w:tentative="1">
+      <w:start w:val="1"/>
+      <w:numFmt w:val="lowerLetter"/>
+      <w:lvlText w:val="%5."/>
+      <w:lvlJc w:val="left"/>
+      <w:pPr>
+        <w:ind w:left="3600" w:hanging="360"/>
+      </w:pPr>
+    </w:lvl>
+    <w:lvl w:ilvl="5" w:tplc="FFFFFFFF" w:tentative="1">
+      <w:start w:val="1"/>
+      <w:numFmt w:val="lowerRoman"/>
+      <w:lvlText w:val="%6."/>
+      <w:lvlJc w:val="right"/>
+      <w:pPr>
+        <w:ind w:left="4320" w:hanging="180"/>
+      </w:pPr>
+    </w:lvl>
+    <w:lvl w:ilvl="6" w:tplc="FFFFFFFF" w:tentative="1">
+      <w:start w:val="1"/>
+      <w:numFmt w:val="decimal"/>
+      <w:lvlText w:val="%7."/>
+      <w:lvlJc w:val="left"/>
+      <w:pPr>
+        <w:ind w:left="5040" w:hanging="360"/>
+      </w:pPr>
+    </w:lvl>
+    <w:lvl w:ilvl="7" w:tplc="FFFFFFFF" w:tentative="1">
+      <w:start w:val="1"/>
+      <w:numFmt w:val="lowerLetter"/>
+      <w:lvlText w:val="%8."/>
+      <w:lvlJc w:val="left"/>
+      <w:pPr>
+        <w:ind w:left="5760" w:hanging="360"/>
+      </w:pPr>
+    </w:lvl>
+    <w:lvl w:ilvl="8" w:tplc="FFFFFFFF" w:tentative="1">
+      <w:start w:val="1"/>
+      <w:numFmt w:val="lowerRoman"/>
+      <w:lvlText w:val="%9."/>
+      <w:lvlJc w:val="right"/>
+      <w:pPr>
+        <w:ind w:left="6480" w:hanging="180"/>
+      </w:pPr>
+    </w:lvl>
+  </w:abstractNum>
+  <w:abstractNum w:abstractNumId="7" w15:restartNumberingAfterBreak="0">
     <w:nsid w:val="63916B83"/>
     <w:multiLevelType w:val="hybridMultilevel"/>
     <w:tmpl w:val="AE7C571E"/>
@@ -2115,7 +3420,7 @@
       </w:pPr>
     </w:lvl>
   </w:abstractNum>
-  <w:abstractNum w:abstractNumId="3" w15:restartNumberingAfterBreak="0">
+  <w:abstractNum w:abstractNumId="8" w15:restartNumberingAfterBreak="0">
     <w:nsid w:val="652F7974"/>
     <w:multiLevelType w:val="hybridMultilevel"/>
     <w:tmpl w:val="585C541E"/>
@@ -2228,7 +3533,206 @@
       </w:rPr>
     </w:lvl>
   </w:abstractNum>
-  <w:abstractNum w:abstractNumId="4" w15:restartNumberingAfterBreak="0">
+  <w:abstractNum w:abstractNumId="9" w15:restartNumberingAfterBreak="0">
+    <w:nsid w:val="723B1CEF"/>
+    <w:multiLevelType w:val="hybridMultilevel"/>
+    <w:tmpl w:val="7CF09AAE"/>
+    <w:lvl w:ilvl="0" w:tplc="0409000F">
+      <w:start w:val="1"/>
+      <w:numFmt w:val="decimal"/>
+      <w:lvlText w:val="%1."/>
+      <w:lvlJc w:val="left"/>
+      <w:pPr>
+        <w:ind w:left="720" w:hanging="360"/>
+      </w:pPr>
+    </w:lvl>
+    <w:lvl w:ilvl="1" w:tplc="04090019">
+      <w:start w:val="1"/>
+      <w:numFmt w:val="lowerLetter"/>
+      <w:lvlText w:val="%2."/>
+      <w:lvlJc w:val="left"/>
+      <w:pPr>
+        <w:ind w:left="1440" w:hanging="360"/>
+      </w:pPr>
+    </w:lvl>
+    <w:lvl w:ilvl="2" w:tplc="0409001B" w:tentative="1">
+      <w:start w:val="1"/>
+      <w:numFmt w:val="lowerRoman"/>
+      <w:lvlText w:val="%3."/>
+      <w:lvlJc w:val="right"/>
+      <w:pPr>
+        <w:ind w:left="2160" w:hanging="180"/>
+      </w:pPr>
+    </w:lvl>
+    <w:lvl w:ilvl="3" w:tplc="0409000F" w:tentative="1">
+      <w:start w:val="1"/>
+      <w:numFmt w:val="decimal"/>
+      <w:lvlText w:val="%4."/>
+      <w:lvlJc w:val="left"/>
+      <w:pPr>
+        <w:ind w:left="2880" w:hanging="360"/>
+      </w:pPr>
+    </w:lvl>
+    <w:lvl w:ilvl="4" w:tplc="04090019" w:tentative="1">
+      <w:start w:val="1"/>
+      <w:numFmt w:val="lowerLetter"/>
+      <w:lvlText w:val="%5."/>
+      <w:lvlJc w:val="left"/>
+      <w:pPr>
+        <w:ind w:left="3600" w:hanging="360"/>
+      </w:pPr>
+    </w:lvl>
+    <w:lvl w:ilvl="5" w:tplc="0409001B" w:tentative="1">
+      <w:start w:val="1"/>
+      <w:numFmt w:val="lowerRoman"/>
+      <w:lvlText w:val="%6."/>
+      <w:lvlJc w:val="right"/>
+      <w:pPr>
+        <w:ind w:left="4320" w:hanging="180"/>
+      </w:pPr>
+    </w:lvl>
+    <w:lvl w:ilvl="6" w:tplc="0409000F" w:tentative="1">
+      <w:start w:val="1"/>
+      <w:numFmt w:val="decimal"/>
+      <w:lvlText w:val="%7."/>
+      <w:lvlJc w:val="left"/>
+      <w:pPr>
+        <w:ind w:left="5040" w:hanging="360"/>
+      </w:pPr>
+    </w:lvl>
+    <w:lvl w:ilvl="7" w:tplc="04090019" w:tentative="1">
+      <w:start w:val="1"/>
+      <w:numFmt w:val="lowerLetter"/>
+      <w:lvlText w:val="%8."/>
+      <w:lvlJc w:val="left"/>
+      <w:pPr>
+        <w:ind w:left="5760" w:hanging="360"/>
+      </w:pPr>
+    </w:lvl>
+    <w:lvl w:ilvl="8" w:tplc="0409001B" w:tentative="1">
+      <w:start w:val="1"/>
+      <w:numFmt w:val="lowerRoman"/>
+      <w:lvlText w:val="%9."/>
+      <w:lvlJc w:val="right"/>
+      <w:pPr>
+        <w:ind w:left="6480" w:hanging="180"/>
+      </w:pPr>
+    </w:lvl>
+  </w:abstractNum>
+  <w:abstractNum w:abstractNumId="10" w15:restartNumberingAfterBreak="0">
+    <w:nsid w:val="76EC0F70"/>
+    <w:multiLevelType w:val="hybridMultilevel"/>
+    <w:tmpl w:val="DFE62CD6"/>
+    <w:lvl w:ilvl="0" w:tplc="04090001">
+      <w:start w:val="1"/>
+      <w:numFmt w:val="bullet"/>
+      <w:lvlText w:val=""/>
+      <w:lvlJc w:val="left"/>
+      <w:pPr>
+        <w:ind w:left="720" w:hanging="360"/>
+      </w:pPr>
+      <w:rPr>
+        <w:rFonts w:ascii="Symbol" w:hAnsi="Symbol" w:hint="default"/>
+      </w:rPr>
+    </w:lvl>
+    <w:lvl w:ilvl="1" w:tplc="04090003" w:tentative="1">
+      <w:start w:val="1"/>
+      <w:numFmt w:val="bullet"/>
+      <w:lvlText w:val="o"/>
+      <w:lvlJc w:val="left"/>
+      <w:pPr>
+        <w:ind w:left="1440" w:hanging="360"/>
+      </w:pPr>
+      <w:rPr>
+        <w:rFonts w:ascii="Courier New" w:hAnsi="Courier New" w:cs="Courier New" w:hint="default"/>
+      </w:rPr>
+    </w:lvl>
+    <w:lvl w:ilvl="2" w:tplc="04090005" w:tentative="1">
+      <w:start w:val="1"/>
+      <w:numFmt w:val="bullet"/>
+      <w:lvlText w:val=""/>
+      <w:lvlJc w:val="left"/>
+      <w:pPr>
+        <w:ind w:left="2160" w:hanging="360"/>
+      </w:pPr>
+      <w:rPr>
+        <w:rFonts w:ascii="Wingdings" w:hAnsi="Wingdings" w:hint="default"/>
+      </w:rPr>
+    </w:lvl>
+    <w:lvl w:ilvl="3" w:tplc="04090001" w:tentative="1">
+      <w:start w:val="1"/>
+      <w:numFmt w:val="bullet"/>
+      <w:lvlText w:val=""/>
+      <w:lvlJc w:val="left"/>
+      <w:pPr>
+        <w:ind w:left="2880" w:hanging="360"/>
+      </w:pPr>
+      <w:rPr>
+        <w:rFonts w:ascii="Symbol" w:hAnsi="Symbol" w:hint="default"/>
+      </w:rPr>
+    </w:lvl>
+    <w:lvl w:ilvl="4" w:tplc="04090003" w:tentative="1">
+      <w:start w:val="1"/>
+      <w:numFmt w:val="bullet"/>
+      <w:lvlText w:val="o"/>
+      <w:lvlJc w:val="left"/>
+      <w:pPr>
+        <w:ind w:left="3600" w:hanging="360"/>
+      </w:pPr>
+      <w:rPr>
+        <w:rFonts w:ascii="Courier New" w:hAnsi="Courier New" w:cs="Courier New" w:hint="default"/>
+      </w:rPr>
+    </w:lvl>
+    <w:lvl w:ilvl="5" w:tplc="04090005" w:tentative="1">
+      <w:start w:val="1"/>
+      <w:numFmt w:val="bullet"/>
+      <w:lvlText w:val=""/>
+      <w:lvlJc w:val="left"/>
+      <w:pPr>
+        <w:ind w:left="4320" w:hanging="360"/>
+      </w:pPr>
+      <w:rPr>
+        <w:rFonts w:ascii="Wingdings" w:hAnsi="Wingdings" w:hint="default"/>
+      </w:rPr>
+    </w:lvl>
+    <w:lvl w:ilvl="6" w:tplc="04090001" w:tentative="1">
+      <w:start w:val="1"/>
+      <w:numFmt w:val="bullet"/>
+      <w:lvlText w:val=""/>
+      <w:lvlJc w:val="left"/>
+      <w:pPr>
+        <w:ind w:left="5040" w:hanging="360"/>
+      </w:pPr>
+      <w:rPr>
+        <w:rFonts w:ascii="Symbol" w:hAnsi="Symbol" w:hint="default"/>
+      </w:rPr>
+    </w:lvl>
+    <w:lvl w:ilvl="7" w:tplc="04090003" w:tentative="1">
+      <w:start w:val="1"/>
+      <w:numFmt w:val="bullet"/>
+      <w:lvlText w:val="o"/>
+      <w:lvlJc w:val="left"/>
+      <w:pPr>
+        <w:ind w:left="5760" w:hanging="360"/>
+      </w:pPr>
+      <w:rPr>
+        <w:rFonts w:ascii="Courier New" w:hAnsi="Courier New" w:cs="Courier New" w:hint="default"/>
+      </w:rPr>
+    </w:lvl>
+    <w:lvl w:ilvl="8" w:tplc="04090005" w:tentative="1">
+      <w:start w:val="1"/>
+      <w:numFmt w:val="bullet"/>
+      <w:lvlText w:val=""/>
+      <w:lvlJc w:val="left"/>
+      <w:pPr>
+        <w:ind w:left="6480" w:hanging="360"/>
+      </w:pPr>
+      <w:rPr>
+        <w:rFonts w:ascii="Wingdings" w:hAnsi="Wingdings" w:hint="default"/>
+      </w:rPr>
+    </w:lvl>
+  </w:abstractNum>
+  <w:abstractNum w:abstractNumId="11" w15:restartNumberingAfterBreak="0">
     <w:nsid w:val="7DE17BC2"/>
     <w:multiLevelType w:val="hybridMultilevel"/>
     <w:tmpl w:val="44560380"/>
@@ -2342,19 +3846,40 @@
     </w:lvl>
   </w:abstractNum>
   <w:num w:numId="1" w16cid:durableId="1535389038">
+    <w:abstractNumId w:val="4"/>
+  </w:num>
+  <w:num w:numId="2" w16cid:durableId="736975654">
+    <w:abstractNumId w:val="11"/>
+  </w:num>
+  <w:num w:numId="3" w16cid:durableId="1098670555">
+    <w:abstractNumId w:val="7"/>
+  </w:num>
+  <w:num w:numId="4" w16cid:durableId="1360543433">
+    <w:abstractNumId w:val="8"/>
+  </w:num>
+  <w:num w:numId="5" w16cid:durableId="257713793">
+    <w:abstractNumId w:val="2"/>
+  </w:num>
+  <w:num w:numId="6" w16cid:durableId="1170801312">
+    <w:abstractNumId w:val="9"/>
+  </w:num>
+  <w:num w:numId="7" w16cid:durableId="1947155042">
+    <w:abstractNumId w:val="6"/>
+  </w:num>
+  <w:num w:numId="8" w16cid:durableId="2122527335">
+    <w:abstractNumId w:val="0"/>
+  </w:num>
+  <w:num w:numId="9" w16cid:durableId="2127582511">
+    <w:abstractNumId w:val="5"/>
+  </w:num>
+  <w:num w:numId="10" w16cid:durableId="1761020347">
+    <w:abstractNumId w:val="3"/>
+  </w:num>
+  <w:num w:numId="11" w16cid:durableId="379865646">
     <w:abstractNumId w:val="1"/>
   </w:num>
-  <w:num w:numId="2" w16cid:durableId="736975654">
-    <w:abstractNumId w:val="4"/>
-  </w:num>
-  <w:num w:numId="3" w16cid:durableId="1098670555">
-    <w:abstractNumId w:val="2"/>
-  </w:num>
-  <w:num w:numId="4" w16cid:durableId="1360543433">
-    <w:abstractNumId w:val="3"/>
-  </w:num>
-  <w:num w:numId="5" w16cid:durableId="257713793">
-    <w:abstractNumId w:val="0"/>
+  <w:num w:numId="12" w16cid:durableId="268900793">
+    <w:abstractNumId w:val="10"/>
   </w:num>
 </w:numbering>
 </file>
@@ -3320,6 +4845,50 @@
       <w14:ligatures w14:val="none"/>
     </w:rPr>
   </w:style>
+  <w:style w:type="paragraph" w:styleId="Header">
+    <w:name w:val="header"/>
+    <w:basedOn w:val="Normal"/>
+    <w:link w:val="HeaderChar"/>
+    <w:uiPriority w:val="99"/>
+    <w:unhideWhenUsed/>
+    <w:rsid w:val="00194AF3"/>
+    <w:pPr>
+      <w:tabs>
+        <w:tab w:val="center" w:pos="4680"/>
+        <w:tab w:val="right" w:pos="9360"/>
+      </w:tabs>
+      <w:spacing w:after="0" w:line="240" w:lineRule="auto"/>
+    </w:pPr>
+  </w:style>
+  <w:style w:type="character" w:customStyle="1" w:styleId="HeaderChar">
+    <w:name w:val="Header Char"/>
+    <w:basedOn w:val="DefaultParagraphFont"/>
+    <w:link w:val="Header"/>
+    <w:uiPriority w:val="99"/>
+    <w:rsid w:val="00194AF3"/>
+  </w:style>
+  <w:style w:type="paragraph" w:styleId="Footer">
+    <w:name w:val="footer"/>
+    <w:basedOn w:val="Normal"/>
+    <w:link w:val="FooterChar"/>
+    <w:uiPriority w:val="99"/>
+    <w:unhideWhenUsed/>
+    <w:rsid w:val="00194AF3"/>
+    <w:pPr>
+      <w:tabs>
+        <w:tab w:val="center" w:pos="4680"/>
+        <w:tab w:val="right" w:pos="9360"/>
+      </w:tabs>
+      <w:spacing w:after="0" w:line="240" w:lineRule="auto"/>
+    </w:pPr>
+  </w:style>
+  <w:style w:type="character" w:customStyle="1" w:styleId="FooterChar">
+    <w:name w:val="Footer Char"/>
+    <w:basedOn w:val="DefaultParagraphFont"/>
+    <w:link w:val="Footer"/>
+    <w:uiPriority w:val="99"/>
+    <w:rsid w:val="00194AF3"/>
+  </w:style>
 </w:styles>
 </file>
 
@@ -3462,19 +5031,19 @@
     <w:pitch w:val="variable"/>
     <w:sig w:usb0="E0002EFF" w:usb1="C000785B" w:usb2="00000009" w:usb3="00000000" w:csb0="000001FF" w:csb1="00000000"/>
   </w:font>
+  <w:font w:name="Courier New">
+    <w:panose1 w:val="02070309020205020404"/>
+    <w:charset w:val="00"/>
+    <w:family w:val="modern"/>
+    <w:pitch w:val="fixed"/>
+    <w:sig w:usb0="E0002EFF" w:usb1="C0007843" w:usb2="00000009" w:usb3="00000000" w:csb0="000001FF" w:csb1="00000000"/>
+  </w:font>
   <w:font w:name="Symbol">
     <w:panose1 w:val="05050102010706020507"/>
     <w:charset w:val="02"/>
     <w:family w:val="roman"/>
     <w:pitch w:val="variable"/>
     <w:sig w:usb0="00000000" w:usb1="10000000" w:usb2="00000000" w:usb3="00000000" w:csb0="80000000" w:csb1="00000000"/>
-  </w:font>
-  <w:font w:name="Courier New">
-    <w:panose1 w:val="02070309020205020404"/>
-    <w:charset w:val="00"/>
-    <w:family w:val="modern"/>
-    <w:pitch w:val="fixed"/>
-    <w:sig w:usb0="E0002EFF" w:usb1="C0007843" w:usb2="00000009" w:usb3="00000000" w:csb0="000001FF" w:csb1="00000000"/>
   </w:font>
   <w:font w:name="Wingdings">
     <w:panose1 w:val="05000000000000000000"/>
@@ -3535,12 +5104,12 @@
   </w:compat>
   <w:rsids>
     <w:rsidRoot w:val="007B161D"/>
+    <w:rsid w:val="003F500F"/>
     <w:rsid w:val="00677E48"/>
     <w:rsid w:val="00726275"/>
     <w:rsid w:val="007B161D"/>
     <w:rsid w:val="008C6D48"/>
     <w:rsid w:val="009200DD"/>
-    <w:rsid w:val="00C90C84"/>
   </w:rsids>
   <m:mathPr>
     <m:mathFont m:val="Cambria Math"/>

</xml_diff>

<commit_message>
replaced screenshot images whit high quality versions
</commit_message>
<xml_diff>
--- a/Documentation/DBGuard user-manual.docx
+++ b/Documentation/DBGuard user-manual.docx
@@ -101,15 +101,6 @@
                         <w:szCs w:val="88"/>
                       </w:rPr>
                     </w:pPr>
-                    <w:r>
-                      <w:rPr>
-                        <w:rFonts w:ascii="Arial" w:eastAsiaTheme="majorEastAsia" w:hAnsi="Arial" w:cs="Arial"/>
-                        <w:color w:val="156082" w:themeColor="accent1"/>
-                        <w:sz w:val="88"/>
-                        <w:szCs w:val="88"/>
-                      </w:rPr>
-                      <w:t xml:space="preserve"> </w:t>
-                    </w:r>
                     <w:proofErr w:type="spellStart"/>
                     <w:r>
                       <w:rPr>
@@ -310,7 +301,12 @@
         <w:sdt>
           <w:sdtPr>
             <w:rPr>
-              <w:rFonts w:ascii="Arial" w:hAnsi="Arial" w:cs="Arial"/>
+              <w:rFonts w:ascii="Arial" w:eastAsiaTheme="minorHAnsi" w:hAnsi="Arial" w:cs="Arial"/>
+              <w:color w:val="auto"/>
+              <w:kern w:val="2"/>
+              <w:sz w:val="24"/>
+              <w:szCs w:val="24"/>
+              <w14:ligatures w14:val="standardContextual"/>
             </w:rPr>
             <w:id w:val="1272203091"/>
             <w:docPartObj>
@@ -320,15 +316,9 @@
           </w:sdtPr>
           <w:sdtEndPr>
             <w:rPr>
-              <w:rFonts w:eastAsiaTheme="minorHAnsi"/>
               <w:b/>
               <w:bCs/>
               <w:noProof/>
-              <w:color w:val="auto"/>
-              <w:kern w:val="2"/>
-              <w:sz w:val="24"/>
-              <w:szCs w:val="24"/>
-              <w14:ligatures w14:val="standardContextual"/>
             </w:rPr>
           </w:sdtEndPr>
           <w:sdtContent>
@@ -4962,9 +4952,9 @@
         </w:rPr>
         <w:lastRenderedPageBreak/>
         <w:drawing>
-          <wp:inline distT="0" distB="0" distL="0" distR="0" wp14:anchorId="68566321" wp14:editId="48D57974">
-            <wp:extent cx="3524250" cy="898383"/>
-            <wp:effectExtent l="0" t="0" r="0" b="0"/>
+          <wp:inline distT="0" distB="0" distL="0" distR="0" wp14:anchorId="68566321" wp14:editId="38F5EB64">
+            <wp:extent cx="6131103" cy="1562908"/>
+            <wp:effectExtent l="0" t="0" r="3175" b="0"/>
             <wp:docPr id="199837857" name="Picture 1"/>
             <wp:cNvGraphicFramePr>
               <a:graphicFrameLocks xmlns:a="http://schemas.openxmlformats.org/drawingml/2006/main" noChangeAspect="1"/>
@@ -4985,7 +4975,7 @@
                   <pic:spPr>
                     <a:xfrm>
                       <a:off x="0" y="0"/>
-                      <a:ext cx="3544982" cy="903668"/>
+                      <a:ext cx="6159994" cy="1570273"/>
                     </a:xfrm>
                     <a:prstGeom prst="rect">
                       <a:avLst/>
@@ -9369,7 +9359,7 @@
           <w:rPr>
             <w:noProof/>
           </w:rPr>
-          <w:t xml:space="preserve"> DBGuard</w:t>
+          <w:t>DBGuard</w:t>
         </w:r>
       </w:sdtContent>
     </w:sdt>
@@ -12852,7 +12842,7 @@
           <w:r>
             <w:rPr>
               <w:rFonts w:asciiTheme="majorHAnsi" w:eastAsiaTheme="majorEastAsia" w:hAnsiTheme="majorHAnsi" w:cstheme="majorBidi"/>
-              <w:color w:val="4472C4" w:themeColor="accent1"/>
+              <w:color w:val="156082" w:themeColor="accent1"/>
               <w:sz w:val="88"/>
               <w:szCs w:val="88"/>
             </w:rPr>
@@ -12883,7 +12873,7 @@
           </w:pPr>
           <w:r>
             <w:rPr>
-              <w:color w:val="2F5496" w:themeColor="accent1" w:themeShade="BF"/>
+              <w:color w:val="0F4761" w:themeColor="accent1" w:themeShade="BF"/>
             </w:rPr>
             <w:t>[Document subtitle]</w:t>
           </w:r>
@@ -12912,7 +12902,7 @@
           </w:pPr>
           <w:r>
             <w:rPr>
-              <w:color w:val="4472C4" w:themeColor="accent1"/>
+              <w:color w:val="156082" w:themeColor="accent1"/>
               <w:sz w:val="28"/>
               <w:szCs w:val="28"/>
             </w:rPr>
@@ -12943,7 +12933,7 @@
           </w:pPr>
           <w:r>
             <w:rPr>
-              <w:color w:val="4472C4" w:themeColor="accent1"/>
+              <w:color w:val="156082" w:themeColor="accent1"/>
               <w:sz w:val="28"/>
               <w:szCs w:val="28"/>
             </w:rPr>
@@ -13031,20 +13021,6 @@
     <w:pitch w:val="variable"/>
     <w:sig w:usb0="E0002EFF" w:usb1="C000785B" w:usb2="00000009" w:usb3="00000000" w:csb0="000001FF" w:csb1="00000000"/>
   </w:font>
-  <w:font w:name="Calibri">
-    <w:panose1 w:val="020F0502020204030204"/>
-    <w:charset w:val="00"/>
-    <w:family w:val="swiss"/>
-    <w:pitch w:val="variable"/>
-    <w:sig w:usb0="E4002EFF" w:usb1="C200247B" w:usb2="00000009" w:usb3="00000000" w:csb0="000001FF" w:csb1="00000000"/>
-  </w:font>
-  <w:font w:name="Calibri Light">
-    <w:panose1 w:val="020F0302020204030204"/>
-    <w:charset w:val="00"/>
-    <w:family w:val="swiss"/>
-    <w:pitch w:val="variable"/>
-    <w:sig w:usb0="E4002EFF" w:usb1="C200247B" w:usb2="00000009" w:usb3="00000000" w:csb0="000001FF" w:csb1="00000000"/>
-  </w:font>
 </w:fonts>
 </file>
 
@@ -13066,8 +13042,10 @@
     <w:rsidRoot w:val="007B161D"/>
     <w:rsid w:val="000E2BB0"/>
     <w:rsid w:val="00101268"/>
+    <w:rsid w:val="002503D6"/>
     <w:rsid w:val="002E080D"/>
     <w:rsid w:val="00300C64"/>
+    <w:rsid w:val="005C36CD"/>
     <w:rsid w:val="005E52F4"/>
     <w:rsid w:val="00677E48"/>
     <w:rsid w:val="00726275"/>
@@ -13075,6 +13053,7 @@
     <w:rsid w:val="008C6D48"/>
     <w:rsid w:val="009200DD"/>
     <w:rsid w:val="00D33CC1"/>
+    <w:rsid w:val="00F82569"/>
   </w:rsids>
   <m:mathPr>
     <m:mathFont m:val="Cambria Math"/>

</xml_diff>